<commit_message>
docs: actualizar PDFs y PPTX con esquematicos EasyEDA y enlaces GitHub
</commit_message>
<xml_diff>
--- a/01_DOCUMENTOS_ACADEMICOS_FIME/AF2_Presentacion_Resultados_Examen_Ordinario_Paper_Vending_FIME.docx
+++ b/01_DOCUMENTOS_ACADEMICOS_FIME/AF2_Presentacion_Resultados_Examen_Ordinario_Paper_Vending_FIME.docx
@@ -29,12 +29,6 @@
               <w:bottom w:val="none"/>
               <w:right w:val="none"/>
             </w:tcBorders>
-            <w:tcBorders>
-              <w:top w:val="none"/>
-              <w:left w:val="none"/>
-              <w:bottom w:val="none"/>
-              <w:right w:val="none"/>
-            </w:tcBorders>
           </w:tcPr>
           <w:p>
             <w:pPr>
@@ -45,7 +39,7 @@
               <w:drawing>
                 <wp:inline xmlns:a="http://schemas.openxmlformats.org/drawingml/2006/main" xmlns:pic="http://schemas.openxmlformats.org/drawingml/2006/picture">
                   <wp:extent cx="1861457" cy="868680"/>
-                  <wp:docPr id="19" name="Picture 19"/>
+                  <wp:docPr id="21" name="Picture 21"/>
                   <wp:cNvGraphicFramePr>
                     <a:graphicFrameLocks noChangeAspect="1"/>
                   </wp:cNvGraphicFramePr>
@@ -92,12 +86,6 @@
               <w:bottom w:val="none"/>
               <w:right w:val="none"/>
             </w:tcBorders>
-            <w:tcBorders>
-              <w:top w:val="none"/>
-              <w:left w:val="none"/>
-              <w:bottom w:val="none"/>
-              <w:right w:val="none"/>
-            </w:tcBorders>
           </w:tcPr>
           <w:p>
             <w:pPr>
@@ -108,7 +96,7 @@
               <w:drawing>
                 <wp:inline xmlns:a="http://schemas.openxmlformats.org/drawingml/2006/main" xmlns:pic="http://schemas.openxmlformats.org/drawingml/2006/picture">
                   <wp:extent cx="1837592" cy="868680"/>
-                  <wp:docPr id="20" name="Picture 20"/>
+                  <wp:docPr id="22" name="Picture 22"/>
                   <wp:cNvGraphicFramePr>
                     <a:graphicFrameLocks noChangeAspect="1"/>
                   </wp:cNvGraphicFramePr>
@@ -251,13 +239,6 @@
               <w:bottom w:val="single" w:sz="4" w:space="0" w:color="70AD47"/>
               <w:right w:val="single" w:sz="4" w:space="0" w:color="70AD47"/>
             </w:tcBorders>
-            <w:shd w:fill="70AD47"/>
-            <w:tcBorders>
-              <w:top w:val="single" w:sz="4" w:space="0" w:color="70AD47"/>
-              <w:left w:val="single" w:sz="4" w:space="0" w:color="70AD47"/>
-              <w:bottom w:val="single" w:sz="4" w:space="0" w:color="70AD47"/>
-              <w:right w:val="single" w:sz="4" w:space="0" w:color="70AD47"/>
-            </w:tcBorders>
           </w:tcPr>
           <w:p>
             <w:pPr>
@@ -292,13 +273,6 @@
               <w:bottom w:val="single" w:sz="4" w:space="0" w:color="70AD47"/>
               <w:right w:val="single" w:sz="4" w:space="0" w:color="70AD47"/>
             </w:tcBorders>
-            <w:shd w:fill="70AD47"/>
-            <w:tcBorders>
-              <w:top w:val="single" w:sz="4" w:space="0" w:color="70AD47"/>
-              <w:left w:val="single" w:sz="4" w:space="0" w:color="70AD47"/>
-              <w:bottom w:val="single" w:sz="4" w:space="0" w:color="70AD47"/>
-              <w:right w:val="single" w:sz="4" w:space="0" w:color="70AD47"/>
-            </w:tcBorders>
           </w:tcPr>
           <w:p>
             <w:pPr>
@@ -325,13 +299,6 @@
               <w:left w:val="single" w:sz="6" w:space="0" w:color="1B365D"/>
               <w:bottom w:val="single" w:sz="6" w:space="0" w:color="1B365D"/>
               <w:right w:val="single" w:sz="6" w:space="0" w:color="1B365D"/>
-            </w:tcBorders>
-            <w:shd w:fill="70AD47"/>
-            <w:tcBorders>
-              <w:top w:val="single" w:sz="4" w:space="0" w:color="70AD47"/>
-              <w:left w:val="single" w:sz="4" w:space="0" w:color="70AD47"/>
-              <w:bottom w:val="single" w:sz="4" w:space="0" w:color="70AD47"/>
-              <w:right w:val="single" w:sz="4" w:space="0" w:color="70AD47"/>
             </w:tcBorders>
             <w:shd w:fill="70AD47"/>
             <w:tcBorders>
@@ -375,12 +342,6 @@
               <w:bottom w:val="single" w:sz="4" w:space="0" w:color="70AD47"/>
               <w:right w:val="single" w:sz="4" w:space="0" w:color="70AD47"/>
             </w:tcBorders>
-            <w:tcBorders>
-              <w:top w:val="single" w:sz="4" w:space="0" w:color="70AD47"/>
-              <w:left w:val="single" w:sz="4" w:space="0" w:color="70AD47"/>
-              <w:bottom w:val="single" w:sz="4" w:space="0" w:color="70AD47"/>
-              <w:right w:val="single" w:sz="4" w:space="0" w:color="70AD47"/>
-            </w:tcBorders>
           </w:tcPr>
           <w:p>
             <w:pPr>
@@ -413,12 +374,6 @@
               <w:bottom w:val="single" w:sz="4" w:space="0" w:color="70AD47"/>
               <w:right w:val="single" w:sz="4" w:space="0" w:color="70AD47"/>
             </w:tcBorders>
-            <w:tcBorders>
-              <w:top w:val="single" w:sz="4" w:space="0" w:color="70AD47"/>
-              <w:left w:val="single" w:sz="4" w:space="0" w:color="70AD47"/>
-              <w:bottom w:val="single" w:sz="4" w:space="0" w:color="70AD47"/>
-              <w:right w:val="single" w:sz="4" w:space="0" w:color="70AD47"/>
-            </w:tcBorders>
           </w:tcPr>
           <w:p>
             <w:pPr>
@@ -444,12 +399,6 @@
               <w:left w:val="single" w:sz="6" w:space="0" w:color="1B365D"/>
               <w:bottom w:val="single" w:sz="6" w:space="0" w:color="1B365D"/>
               <w:right w:val="single" w:sz="6" w:space="0" w:color="1B365D"/>
-            </w:tcBorders>
-            <w:tcBorders>
-              <w:top w:val="single" w:sz="4" w:space="0" w:color="70AD47"/>
-              <w:left w:val="single" w:sz="4" w:space="0" w:color="70AD47"/>
-              <w:bottom w:val="single" w:sz="4" w:space="0" w:color="70AD47"/>
-              <w:right w:val="single" w:sz="4" w:space="0" w:color="70AD47"/>
             </w:tcBorders>
             <w:tcBorders>
               <w:top w:val="single" w:sz="4" w:space="0" w:color="70AD47"/>
@@ -491,12 +440,6 @@
               <w:bottom w:val="single" w:sz="4" w:space="0" w:color="70AD47"/>
               <w:right w:val="single" w:sz="4" w:space="0" w:color="70AD47"/>
             </w:tcBorders>
-            <w:tcBorders>
-              <w:top w:val="single" w:sz="4" w:space="0" w:color="70AD47"/>
-              <w:left w:val="single" w:sz="4" w:space="0" w:color="70AD47"/>
-              <w:bottom w:val="single" w:sz="4" w:space="0" w:color="70AD47"/>
-              <w:right w:val="single" w:sz="4" w:space="0" w:color="70AD47"/>
-            </w:tcBorders>
           </w:tcPr>
           <w:p>
             <w:pPr>
@@ -529,12 +472,6 @@
               <w:bottom w:val="single" w:sz="4" w:space="0" w:color="70AD47"/>
               <w:right w:val="single" w:sz="4" w:space="0" w:color="70AD47"/>
             </w:tcBorders>
-            <w:tcBorders>
-              <w:top w:val="single" w:sz="4" w:space="0" w:color="70AD47"/>
-              <w:left w:val="single" w:sz="4" w:space="0" w:color="70AD47"/>
-              <w:bottom w:val="single" w:sz="4" w:space="0" w:color="70AD47"/>
-              <w:right w:val="single" w:sz="4" w:space="0" w:color="70AD47"/>
-            </w:tcBorders>
           </w:tcPr>
           <w:p>
             <w:pPr>
@@ -560,12 +497,6 @@
               <w:left w:val="single" w:sz="6" w:space="0" w:color="1B365D"/>
               <w:bottom w:val="single" w:sz="6" w:space="0" w:color="1B365D"/>
               <w:right w:val="single" w:sz="6" w:space="0" w:color="1B365D"/>
-            </w:tcBorders>
-            <w:tcBorders>
-              <w:top w:val="single" w:sz="4" w:space="0" w:color="70AD47"/>
-              <w:left w:val="single" w:sz="4" w:space="0" w:color="70AD47"/>
-              <w:bottom w:val="single" w:sz="4" w:space="0" w:color="70AD47"/>
-              <w:right w:val="single" w:sz="4" w:space="0" w:color="70AD47"/>
             </w:tcBorders>
             <w:tcBorders>
               <w:top w:val="single" w:sz="4" w:space="0" w:color="70AD47"/>
@@ -732,6 +663,16 @@
           <w:sz w:val="21"/>
         </w:rPr>
         <w:t>San Nicolás de los Garza, Nuevo León a 22 de octubre de 2026</w:t>
+        <w:br/>
+      </w:r>
+      <w:r>
+        <w:rPr>
+          <w:rFonts w:ascii="Calibri" w:hAnsi="Calibri"/>
+          <w:b/>
+          <w:color w:val="107846"/>
+          <w:sz w:val="19"/>
+        </w:rPr>
+        <w:t>Repositorio Oficial GitHub: https://github.com/Anubys6/ExpendeX-Smart-Vending-FIME</w:t>
       </w:r>
       <w:r>
         <w:br w:type="page"/>
@@ -16179,6 +16120,70 @@
         </w:tc>
       </w:tr>
     </w:tbl>
+    <w:tbl>
+      <w:tblPr>
+        <w:tblW w:type="auto" w:w="0"/>
+        <w:jc w:val="center"/>
+        <w:tblLayout w:type="fixed"/>
+        <w:tblLook w:firstColumn="1" w:firstRow="1" w:lastColumn="0" w:lastRow="0" w:noHBand="0" w:noVBand="1" w:val="04A0"/>
+      </w:tblPr>
+      <w:tblGrid>
+        <w:gridCol w:w="9360"/>
+      </w:tblGrid>
+      <w:tr>
+        <w:trPr>
+          <w:cantSplit/>
+        </w:trPr>
+        <w:tc>
+          <w:tcPr>
+            <w:tcW w:type="dxa" w:w="9360"/>
+            <w:shd w:fill="F1F5F9"/>
+            <w:tcMar>
+              <w:top w:w="140" w:type="dxa"/>
+              <w:left w:w="200" w:type="dxa"/>
+              <w:bottom w:w="140" w:type="dxa"/>
+              <w:right w:w="160" w:type="dxa"/>
+            </w:tcMar>
+            <w:tcBorders>
+              <w:top w:val="none" w:sz="28" w:space="0" w:color="CBD5E1"/>
+              <w:left w:val="single" w:sz="28" w:space="0" w:color="0F2C59"/>
+              <w:bottom w:val="none" w:sz="28" w:space="0" w:color="CBD5E1"/>
+              <w:right w:val="none" w:sz="28" w:space="0" w:color="CBD5E1"/>
+            </w:tcBorders>
+          </w:tcPr>
+          <w:p>
+            <w:pPr>
+              <w:keepLines/>
+              <w:spacing w:line="276" w:lineRule="auto" w:before="0" w:after="0"/>
+            </w:pPr>
+            <w:r>
+              <w:rPr>
+                <w:rFonts w:ascii="Calibri" w:hAnsi="Calibri"/>
+                <w:b/>
+                <w:color w:val="0F2C59"/>
+                <w:sz w:val="20"/>
+              </w:rPr>
+              <w:t>■ REPOSITORIO OFICIAL DEL PROYECTO EN GITHUB</w:t>
+              <w:br/>
+            </w:r>
+            <w:r>
+              <w:rPr>
+                <w:rFonts w:ascii="Calibri" w:hAnsi="Calibri"/>
+                <w:i/>
+                <w:color w:val="1F2937"/>
+                <w:sz w:val="19"/>
+              </w:rPr>
+              <w:t>El ecosistema completo de diseño del proyecto ExpendeX —incluyendo los modelos tridimensionales CAD paramétricos en Autodesk Fusion 360, esquemáticos y diseño de circuito impreso (PCB) en EasyEDA, código fuente del firmware en C++ para ESP32 FreeRTOS (Wokwi / PlatformIO), la suite web del quiosco y panel administrativo, y la documentación académica completa de las 5 Actividades Fundamentales— se encuentra disponible públicamente en el repositorio oficial:</w:t>
+              <w:br/>
+              <w:br/>
+              <w:t>• URL Oficial: https://github.com/Anubys6/ExpendeX-Smart-Vending-FIME</w:t>
+              <w:br/>
+              <w:t>• Licencia: MIT License (Código abierto institucional FIME UANL)</w:t>
+            </w:r>
+          </w:p>
+        </w:tc>
+      </w:tr>
+    </w:tbl>
     <w:p>
       <w:pPr>
         <w:jc w:val="center"/>
@@ -16564,8 +16569,260 @@
       <w:r>
         <w:drawing>
           <wp:inline xmlns:a="http://schemas.openxmlformats.org/drawingml/2006/main" xmlns:pic="http://schemas.openxmlformats.org/drawingml/2006/picture">
+            <wp:extent cx="4937760" cy="2888397"/>
+            <wp:docPr id="14" name="Picture 14"/>
+            <wp:cNvGraphicFramePr>
+              <a:graphicFrameLocks noChangeAspect="1"/>
+            </wp:cNvGraphicFramePr>
+            <a:graphic>
+              <a:graphicData uri="http://schemas.openxmlformats.org/drawingml/2006/picture">
+                <pic:pic>
+                  <pic:nvPicPr>
+                    <pic:cNvPr id="0" name="Img18_EasyEDA_Esquematico_General_Electronica_Potencia_Matriz_6x6.png"/>
+                    <pic:cNvPicPr/>
+                  </pic:nvPicPr>
+                  <pic:blipFill>
+                    <a:blip r:embed="rId24"/>
+                    <a:stretch>
+                      <a:fillRect/>
+                    </a:stretch>
+                  </pic:blipFill>
+                  <pic:spPr>
+                    <a:xfrm>
+                      <a:off x="0" y="0"/>
+                      <a:ext cx="4937760" cy="2888397"/>
+                    </a:xfrm>
+                    <a:prstGeom prst="rect"/>
+                  </pic:spPr>
+                </pic:pic>
+              </a:graphicData>
+            </a:graphic>
+          </wp:inline>
+        </w:drawing>
+      </w:r>
+    </w:p>
+    <w:p>
+      <w:pPr>
+        <w:spacing w:before="60" w:after="160" w:line="276" w:lineRule="auto"/>
+        <w:jc w:val="center"/>
+      </w:pPr>
+      <w:r>
+        <w:rPr>
+          <w:rFonts w:ascii="Calibri" w:hAnsi="Calibri"/>
+          <w:b/>
+          <w:color w:val="0F2C59"/>
+          <w:sz w:val="18"/>
+        </w:rPr>
+        <w:t xml:space="preserve">Figura 13.10. </w:t>
+      </w:r>
+      <w:r>
+        <w:rPr>
+          <w:rFonts w:ascii="Calibri" w:hAnsi="Calibri"/>
+          <w:i/>
+          <w:color w:val="4B5563"/>
+          <w:sz w:val="18"/>
+        </w:rPr>
+        <w:t>Validación del diagrama esquemático integral en EasyEDA: conexionado de potencia +24V, reguladores de voltaje, matriz MOSFET 6×6 y etapa de relé 30A para el compresor de refrigeración.</w:t>
+      </w:r>
+    </w:p>
+    <w:p>
+      <w:pPr>
+        <w:jc w:val="center"/>
+      </w:pPr>
+      <w:r>
+        <w:drawing>
+          <wp:inline xmlns:a="http://schemas.openxmlformats.org/drawingml/2006/main" xmlns:pic="http://schemas.openxmlformats.org/drawingml/2006/picture">
+            <wp:extent cx="4937760" cy="2285643"/>
+            <wp:docPr id="15" name="Picture 15"/>
+            <wp:cNvGraphicFramePr>
+              <a:graphicFrameLocks noChangeAspect="1"/>
+            </wp:cNvGraphicFramePr>
+            <a:graphic>
+              <a:graphicData uri="http://schemas.openxmlformats.org/drawingml/2006/picture">
+                <pic:pic>
+                  <pic:nvPicPr>
+                    <pic:cNvPr id="0" name="Img17_EasyEDA_Simulador_Web_Interactivo_Matriz_MOSFET_6x6.png"/>
+                    <pic:cNvPicPr/>
+                  </pic:nvPicPr>
+                  <pic:blipFill>
+                    <a:blip r:embed="rId25"/>
+                    <a:stretch>
+                      <a:fillRect/>
+                    </a:stretch>
+                  </pic:blipFill>
+                  <pic:spPr>
+                    <a:xfrm>
+                      <a:off x="0" y="0"/>
+                      <a:ext cx="4937760" cy="2285643"/>
+                    </a:xfrm>
+                    <a:prstGeom prst="rect"/>
+                  </pic:spPr>
+                </pic:pic>
+              </a:graphicData>
+            </a:graphic>
+          </wp:inline>
+        </w:drawing>
+      </w:r>
+    </w:p>
+    <w:p>
+      <w:pPr>
+        <w:spacing w:before="60" w:after="160" w:line="276" w:lineRule="auto"/>
+        <w:jc w:val="center"/>
+      </w:pPr>
+      <w:r>
+        <w:rPr>
+          <w:rFonts w:ascii="Calibri" w:hAnsi="Calibri"/>
+          <w:b/>
+          <w:color w:val="0F2C59"/>
+          <w:sz w:val="18"/>
+        </w:rPr>
+        <w:t xml:space="preserve">Figura 13.11. </w:t>
+      </w:r>
+      <w:r>
+        <w:rPr>
+          <w:rFonts w:ascii="Calibri" w:hAnsi="Calibri"/>
+          <w:i/>
+          <w:color w:val="4B5563"/>
+          <w:sz w:val="18"/>
+        </w:rPr>
+        <w:t>Validación en simulador interactivo web de potencia (potencia.html): conmutación en tiempo real del par MOSFET High-Side / Low-Side para 36 motores y verificación de parámetros de disparo.</w:t>
+      </w:r>
+    </w:p>
+    <w:p>
+      <w:pPr>
+        <w:jc w:val="center"/>
+      </w:pPr>
+      <w:r>
+        <w:drawing>
+          <wp:inline xmlns:a="http://schemas.openxmlformats.org/drawingml/2006/main" xmlns:pic="http://schemas.openxmlformats.org/drawingml/2006/picture">
+            <wp:extent cx="4754880" cy="3263734"/>
+            <wp:docPr id="16" name="Picture 16"/>
+            <wp:cNvGraphicFramePr>
+              <a:graphicFrameLocks noChangeAspect="1"/>
+            </wp:cNvGraphicFramePr>
+            <a:graphic>
+              <a:graphicData uri="http://schemas.openxmlformats.org/drawingml/2006/picture">
+                <pic:pic>
+                  <pic:nvPicPr>
+                    <pic:cNvPr id="0" name="Img20_EasyEDA_Detalle_Etapa_LowSide_Filas_MOSFET_Optoacopladores.png"/>
+                    <pic:cNvPicPr/>
+                  </pic:nvPicPr>
+                  <pic:blipFill>
+                    <a:blip r:embed="rId26"/>
+                    <a:stretch>
+                      <a:fillRect/>
+                    </a:stretch>
+                  </pic:blipFill>
+                  <pic:spPr>
+                    <a:xfrm>
+                      <a:off x="0" y="0"/>
+                      <a:ext cx="4754880" cy="3263734"/>
+                    </a:xfrm>
+                    <a:prstGeom prst="rect"/>
+                  </pic:spPr>
+                </pic:pic>
+              </a:graphicData>
+            </a:graphic>
+          </wp:inline>
+        </w:drawing>
+      </w:r>
+    </w:p>
+    <w:p>
+      <w:pPr>
+        <w:spacing w:before="60" w:after="160" w:line="276" w:lineRule="auto"/>
+        <w:jc w:val="center"/>
+      </w:pPr>
+      <w:r>
+        <w:rPr>
+          <w:rFonts w:ascii="Calibri" w:hAnsi="Calibri"/>
+          <w:b/>
+          <w:color w:val="0F2C59"/>
+          <w:sz w:val="18"/>
+        </w:rPr>
+        <w:t xml:space="preserve">Figura 13.12. </w:t>
+      </w:r>
+      <w:r>
+        <w:rPr>
+          <w:rFonts w:ascii="Calibri" w:hAnsi="Calibri"/>
+          <w:i/>
+          <w:color w:val="4B5563"/>
+          <w:sz w:val="18"/>
+        </w:rPr>
+        <w:t>Detalle de conmutación Low-Side (Filas A a F) en EasyEDA: N-MOSFETs IRLZ44NPBF con optoacopladores PC817C, retorno a tierra GND_PWR y resistores de pulldown.</w:t>
+      </w:r>
+    </w:p>
+    <w:p>
+      <w:pPr>
+        <w:jc w:val="center"/>
+      </w:pPr>
+      <w:r>
+        <w:drawing>
+          <wp:inline xmlns:a="http://schemas.openxmlformats.org/drawingml/2006/main" xmlns:pic="http://schemas.openxmlformats.org/drawingml/2006/picture">
+            <wp:extent cx="4754880" cy="3748187"/>
+            <wp:docPr id="17" name="Picture 17"/>
+            <wp:cNvGraphicFramePr>
+              <a:graphicFrameLocks noChangeAspect="1"/>
+            </wp:cNvGraphicFramePr>
+            <a:graphic>
+              <a:graphicData uri="http://schemas.openxmlformats.org/drawingml/2006/picture">
+                <pic:pic>
+                  <pic:nvPicPr>
+                    <pic:cNvPr id="0" name="Img21_EasyEDA_Detalle_Etapa_Control_Refrigeracion_Compresor_Relay_DS18B20.png"/>
+                    <pic:cNvPicPr/>
+                  </pic:nvPicPr>
+                  <pic:blipFill>
+                    <a:blip r:embed="rId27"/>
+                    <a:stretch>
+                      <a:fillRect/>
+                    </a:stretch>
+                  </pic:blipFill>
+                  <pic:spPr>
+                    <a:xfrm>
+                      <a:off x="0" y="0"/>
+                      <a:ext cx="4754880" cy="3748187"/>
+                    </a:xfrm>
+                    <a:prstGeom prst="rect"/>
+                  </pic:spPr>
+                </pic:pic>
+              </a:graphicData>
+            </a:graphic>
+          </wp:inline>
+        </w:drawing>
+      </w:r>
+    </w:p>
+    <w:p>
+      <w:pPr>
+        <w:spacing w:before="60" w:after="160" w:line="276" w:lineRule="auto"/>
+        <w:jc w:val="center"/>
+      </w:pPr>
+      <w:r>
+        <w:rPr>
+          <w:rFonts w:ascii="Calibri" w:hAnsi="Calibri"/>
+          <w:b/>
+          <w:color w:val="0F2C59"/>
+          <w:sz w:val="18"/>
+        </w:rPr>
+        <w:t xml:space="preserve">Figura 13.13. </w:t>
+      </w:r>
+      <w:r>
+        <w:rPr>
+          <w:rFonts w:ascii="Calibri" w:hAnsi="Calibri"/>
+          <w:i/>
+          <w:color w:val="4B5563"/>
+          <w:sz w:val="18"/>
+        </w:rPr>
+        <w:t>Detalle de control de refrigeración en EasyEDA: circuito de activación con relé SLA-05VDC (30A / 250VAC), supresor snubber RC para absorción inductiva del compresor Embraco y sensor 1-Wire DS18B20.</w:t>
+      </w:r>
+    </w:p>
+    <w:p>
+      <w:pPr>
+        <w:jc w:val="center"/>
+      </w:pPr>
+      <w:r>
+        <w:drawing>
+          <wp:inline xmlns:a="http://schemas.openxmlformats.org/drawingml/2006/main" xmlns:pic="http://schemas.openxmlformats.org/drawingml/2006/picture">
             <wp:extent cx="4572000" cy="2286000"/>
-            <wp:docPr id="14" name="Picture 14"/>
+            <wp:docPr id="18" name="Picture 18"/>
             <wp:cNvGraphicFramePr>
               <a:graphicFrameLocks noChangeAspect="1"/>
             </wp:cNvGraphicFramePr>
@@ -16577,7 +16834,7 @@
                     <pic:cNvPicPr/>
                   </pic:nvPicPr>
                   <pic:blipFill>
-                    <a:blip r:embed="rId24"/>
+                    <a:blip r:embed="rId28"/>
                     <a:stretch>
                       <a:fillRect/>
                     </a:stretch>
@@ -16628,7 +16885,7 @@
         <w:drawing>
           <wp:inline xmlns:a="http://schemas.openxmlformats.org/drawingml/2006/main" xmlns:pic="http://schemas.openxmlformats.org/drawingml/2006/picture">
             <wp:extent cx="4389120" cy="5685736"/>
-            <wp:docPr id="15" name="Picture 15"/>
+            <wp:docPr id="19" name="Picture 19"/>
             <wp:cNvGraphicFramePr>
               <a:graphicFrameLocks noChangeAspect="1"/>
             </wp:cNvGraphicFramePr>
@@ -16640,7 +16897,7 @@
                     <pic:cNvPicPr/>
                   </pic:nvPicPr>
                   <pic:blipFill>
-                    <a:blip r:embed="rId25"/>
+                    <a:blip r:embed="rId29"/>
                     <a:stretch>
                       <a:fillRect/>
                     </a:stretch>
@@ -16691,7 +16948,7 @@
         <w:drawing>
           <wp:inline xmlns:a="http://schemas.openxmlformats.org/drawingml/2006/main" xmlns:pic="http://schemas.openxmlformats.org/drawingml/2006/picture">
             <wp:extent cx="4572000" cy="2790477"/>
-            <wp:docPr id="16" name="Picture 16"/>
+            <wp:docPr id="20" name="Picture 20"/>
             <wp:cNvGraphicFramePr>
               <a:graphicFrameLocks noChangeAspect="1"/>
             </wp:cNvGraphicFramePr>
@@ -16703,7 +16960,7 @@
                     <pic:cNvPicPr/>
                   </pic:nvPicPr>
                   <pic:blipFill>
-                    <a:blip r:embed="rId26"/>
+                    <a:blip r:embed="rId30"/>
                     <a:stretch>
                       <a:fillRect/>
                     </a:stretch>

</xml_diff>

<commit_message>
docs: citar formalmente el Programa de Evidencias de Aprendizaje de la U.A. Proyecto de Ingenieria Aplicada (IEAI) y acceso abierto via link en todas las AFs
</commit_message>
<xml_diff>
--- a/01_DOCUMENTOS_ACADEMICOS_FIME/AF2_Presentacion_Resultados_Examen_Ordinario_Paper_Vending_FIME.docx
+++ b/01_DOCUMENTOS_ACADEMICOS_FIME/AF2_Presentacion_Resultados_Examen_Ordinario_Paper_Vending_FIME.docx
@@ -29,6 +29,12 @@
               <w:bottom w:val="none"/>
               <w:right w:val="none"/>
             </w:tcBorders>
+            <w:tcBorders>
+              <w:top w:val="none"/>
+              <w:left w:val="none"/>
+              <w:bottom w:val="none"/>
+              <w:right w:val="none"/>
+            </w:tcBorders>
           </w:tcPr>
           <w:p>
             <w:pPr>
@@ -39,7 +45,7 @@
               <w:drawing>
                 <wp:inline xmlns:a="http://schemas.openxmlformats.org/drawingml/2006/main" xmlns:pic="http://schemas.openxmlformats.org/drawingml/2006/picture">
                   <wp:extent cx="1861457" cy="868680"/>
-                  <wp:docPr id="21" name="Picture 21"/>
+                  <wp:docPr id="19" name="Picture 19"/>
                   <wp:cNvGraphicFramePr>
                     <a:graphicFrameLocks noChangeAspect="1"/>
                   </wp:cNvGraphicFramePr>
@@ -86,6 +92,12 @@
               <w:bottom w:val="none"/>
               <w:right w:val="none"/>
             </w:tcBorders>
+            <w:tcBorders>
+              <w:top w:val="none"/>
+              <w:left w:val="none"/>
+              <w:bottom w:val="none"/>
+              <w:right w:val="none"/>
+            </w:tcBorders>
           </w:tcPr>
           <w:p>
             <w:pPr>
@@ -96,7 +108,7 @@
               <w:drawing>
                 <wp:inline xmlns:a="http://schemas.openxmlformats.org/drawingml/2006/main" xmlns:pic="http://schemas.openxmlformats.org/drawingml/2006/picture">
                   <wp:extent cx="1837592" cy="868680"/>
-                  <wp:docPr id="22" name="Picture 22"/>
+                  <wp:docPr id="20" name="Picture 20"/>
                   <wp:cNvGraphicFramePr>
                     <a:graphicFrameLocks noChangeAspect="1"/>
                   </wp:cNvGraphicFramePr>
@@ -239,6 +251,13 @@
               <w:bottom w:val="single" w:sz="4" w:space="0" w:color="70AD47"/>
               <w:right w:val="single" w:sz="4" w:space="0" w:color="70AD47"/>
             </w:tcBorders>
+            <w:shd w:fill="70AD47"/>
+            <w:tcBorders>
+              <w:top w:val="single" w:sz="4" w:space="0" w:color="70AD47"/>
+              <w:left w:val="single" w:sz="4" w:space="0" w:color="70AD47"/>
+              <w:bottom w:val="single" w:sz="4" w:space="0" w:color="70AD47"/>
+              <w:right w:val="single" w:sz="4" w:space="0" w:color="70AD47"/>
+            </w:tcBorders>
           </w:tcPr>
           <w:p>
             <w:pPr>
@@ -273,6 +292,13 @@
               <w:bottom w:val="single" w:sz="4" w:space="0" w:color="70AD47"/>
               <w:right w:val="single" w:sz="4" w:space="0" w:color="70AD47"/>
             </w:tcBorders>
+            <w:shd w:fill="70AD47"/>
+            <w:tcBorders>
+              <w:top w:val="single" w:sz="4" w:space="0" w:color="70AD47"/>
+              <w:left w:val="single" w:sz="4" w:space="0" w:color="70AD47"/>
+              <w:bottom w:val="single" w:sz="4" w:space="0" w:color="70AD47"/>
+              <w:right w:val="single" w:sz="4" w:space="0" w:color="70AD47"/>
+            </w:tcBorders>
           </w:tcPr>
           <w:p>
             <w:pPr>
@@ -299,6 +325,13 @@
               <w:left w:val="single" w:sz="6" w:space="0" w:color="1B365D"/>
               <w:bottom w:val="single" w:sz="6" w:space="0" w:color="1B365D"/>
               <w:right w:val="single" w:sz="6" w:space="0" w:color="1B365D"/>
+            </w:tcBorders>
+            <w:shd w:fill="70AD47"/>
+            <w:tcBorders>
+              <w:top w:val="single" w:sz="4" w:space="0" w:color="70AD47"/>
+              <w:left w:val="single" w:sz="4" w:space="0" w:color="70AD47"/>
+              <w:bottom w:val="single" w:sz="4" w:space="0" w:color="70AD47"/>
+              <w:right w:val="single" w:sz="4" w:space="0" w:color="70AD47"/>
             </w:tcBorders>
             <w:shd w:fill="70AD47"/>
             <w:tcBorders>
@@ -342,6 +375,12 @@
               <w:bottom w:val="single" w:sz="4" w:space="0" w:color="70AD47"/>
               <w:right w:val="single" w:sz="4" w:space="0" w:color="70AD47"/>
             </w:tcBorders>
+            <w:tcBorders>
+              <w:top w:val="single" w:sz="4" w:space="0" w:color="70AD47"/>
+              <w:left w:val="single" w:sz="4" w:space="0" w:color="70AD47"/>
+              <w:bottom w:val="single" w:sz="4" w:space="0" w:color="70AD47"/>
+              <w:right w:val="single" w:sz="4" w:space="0" w:color="70AD47"/>
+            </w:tcBorders>
           </w:tcPr>
           <w:p>
             <w:pPr>
@@ -374,6 +413,12 @@
               <w:bottom w:val="single" w:sz="4" w:space="0" w:color="70AD47"/>
               <w:right w:val="single" w:sz="4" w:space="0" w:color="70AD47"/>
             </w:tcBorders>
+            <w:tcBorders>
+              <w:top w:val="single" w:sz="4" w:space="0" w:color="70AD47"/>
+              <w:left w:val="single" w:sz="4" w:space="0" w:color="70AD47"/>
+              <w:bottom w:val="single" w:sz="4" w:space="0" w:color="70AD47"/>
+              <w:right w:val="single" w:sz="4" w:space="0" w:color="70AD47"/>
+            </w:tcBorders>
           </w:tcPr>
           <w:p>
             <w:pPr>
@@ -399,6 +444,12 @@
               <w:left w:val="single" w:sz="6" w:space="0" w:color="1B365D"/>
               <w:bottom w:val="single" w:sz="6" w:space="0" w:color="1B365D"/>
               <w:right w:val="single" w:sz="6" w:space="0" w:color="1B365D"/>
+            </w:tcBorders>
+            <w:tcBorders>
+              <w:top w:val="single" w:sz="4" w:space="0" w:color="70AD47"/>
+              <w:left w:val="single" w:sz="4" w:space="0" w:color="70AD47"/>
+              <w:bottom w:val="single" w:sz="4" w:space="0" w:color="70AD47"/>
+              <w:right w:val="single" w:sz="4" w:space="0" w:color="70AD47"/>
             </w:tcBorders>
             <w:tcBorders>
               <w:top w:val="single" w:sz="4" w:space="0" w:color="70AD47"/>
@@ -440,6 +491,12 @@
               <w:bottom w:val="single" w:sz="4" w:space="0" w:color="70AD47"/>
               <w:right w:val="single" w:sz="4" w:space="0" w:color="70AD47"/>
             </w:tcBorders>
+            <w:tcBorders>
+              <w:top w:val="single" w:sz="4" w:space="0" w:color="70AD47"/>
+              <w:left w:val="single" w:sz="4" w:space="0" w:color="70AD47"/>
+              <w:bottom w:val="single" w:sz="4" w:space="0" w:color="70AD47"/>
+              <w:right w:val="single" w:sz="4" w:space="0" w:color="70AD47"/>
+            </w:tcBorders>
           </w:tcPr>
           <w:p>
             <w:pPr>
@@ -472,6 +529,12 @@
               <w:bottom w:val="single" w:sz="4" w:space="0" w:color="70AD47"/>
               <w:right w:val="single" w:sz="4" w:space="0" w:color="70AD47"/>
             </w:tcBorders>
+            <w:tcBorders>
+              <w:top w:val="single" w:sz="4" w:space="0" w:color="70AD47"/>
+              <w:left w:val="single" w:sz="4" w:space="0" w:color="70AD47"/>
+              <w:bottom w:val="single" w:sz="4" w:space="0" w:color="70AD47"/>
+              <w:right w:val="single" w:sz="4" w:space="0" w:color="70AD47"/>
+            </w:tcBorders>
           </w:tcPr>
           <w:p>
             <w:pPr>
@@ -497,6 +560,12 @@
               <w:left w:val="single" w:sz="6" w:space="0" w:color="1B365D"/>
               <w:bottom w:val="single" w:sz="6" w:space="0" w:color="1B365D"/>
               <w:right w:val="single" w:sz="6" w:space="0" w:color="1B365D"/>
+            </w:tcBorders>
+            <w:tcBorders>
+              <w:top w:val="single" w:sz="4" w:space="0" w:color="70AD47"/>
+              <w:left w:val="single" w:sz="4" w:space="0" w:color="70AD47"/>
+              <w:bottom w:val="single" w:sz="4" w:space="0" w:color="70AD47"/>
+              <w:right w:val="single" w:sz="4" w:space="0" w:color="70AD47"/>
             </w:tcBorders>
             <w:tcBorders>
               <w:top w:val="single" w:sz="4" w:space="0" w:color="70AD47"/>
@@ -663,16 +732,6 @@
           <w:sz w:val="21"/>
         </w:rPr>
         <w:t>San Nicolás de los Garza, Nuevo León a 22 de octubre de 2026</w:t>
-        <w:br/>
-      </w:r>
-      <w:r>
-        <w:rPr>
-          <w:rFonts w:ascii="Calibri" w:hAnsi="Calibri"/>
-          <w:b/>
-          <w:color w:val="107846"/>
-          <w:sz w:val="19"/>
-        </w:rPr>
-        <w:t>Repositorio Oficial GitHub: https://github.com/Anubys6/ExpendeX-Smart-Vending-FIME</w:t>
       </w:r>
       <w:r>
         <w:br w:type="page"/>
@@ -16120,70 +16179,6 @@
         </w:tc>
       </w:tr>
     </w:tbl>
-    <w:tbl>
-      <w:tblPr>
-        <w:tblW w:type="auto" w:w="0"/>
-        <w:jc w:val="center"/>
-        <w:tblLayout w:type="fixed"/>
-        <w:tblLook w:firstColumn="1" w:firstRow="1" w:lastColumn="0" w:lastRow="0" w:noHBand="0" w:noVBand="1" w:val="04A0"/>
-      </w:tblPr>
-      <w:tblGrid>
-        <w:gridCol w:w="9360"/>
-      </w:tblGrid>
-      <w:tr>
-        <w:trPr>
-          <w:cantSplit/>
-        </w:trPr>
-        <w:tc>
-          <w:tcPr>
-            <w:tcW w:type="dxa" w:w="9360"/>
-            <w:shd w:fill="F1F5F9"/>
-            <w:tcMar>
-              <w:top w:w="140" w:type="dxa"/>
-              <w:left w:w="200" w:type="dxa"/>
-              <w:bottom w:w="140" w:type="dxa"/>
-              <w:right w:w="160" w:type="dxa"/>
-            </w:tcMar>
-            <w:tcBorders>
-              <w:top w:val="none" w:sz="28" w:space="0" w:color="CBD5E1"/>
-              <w:left w:val="single" w:sz="28" w:space="0" w:color="0F2C59"/>
-              <w:bottom w:val="none" w:sz="28" w:space="0" w:color="CBD5E1"/>
-              <w:right w:val="none" w:sz="28" w:space="0" w:color="CBD5E1"/>
-            </w:tcBorders>
-          </w:tcPr>
-          <w:p>
-            <w:pPr>
-              <w:keepLines/>
-              <w:spacing w:line="276" w:lineRule="auto" w:before="0" w:after="0"/>
-            </w:pPr>
-            <w:r>
-              <w:rPr>
-                <w:rFonts w:ascii="Calibri" w:hAnsi="Calibri"/>
-                <w:b/>
-                <w:color w:val="0F2C59"/>
-                <w:sz w:val="20"/>
-              </w:rPr>
-              <w:t>■ REPOSITORIO OFICIAL DEL PROYECTO EN GITHUB</w:t>
-              <w:br/>
-            </w:r>
-            <w:r>
-              <w:rPr>
-                <w:rFonts w:ascii="Calibri" w:hAnsi="Calibri"/>
-                <w:i/>
-                <w:color w:val="1F2937"/>
-                <w:sz w:val="19"/>
-              </w:rPr>
-              <w:t>El ecosistema completo de diseño del proyecto ExpendeX —incluyendo los modelos tridimensionales CAD paramétricos en Autodesk Fusion 360, esquemáticos y diseño de circuito impreso (PCB) en EasyEDA, código fuente del firmware en C++ para ESP32 FreeRTOS (Wokwi / PlatformIO), la suite web del quiosco y panel administrativo, y la documentación académica completa de las 5 Actividades Fundamentales— se encuentra disponible públicamente en el repositorio oficial:</w:t>
-              <w:br/>
-              <w:br/>
-              <w:t>• URL Oficial: https://github.com/Anubys6/ExpendeX-Smart-Vending-FIME</w:t>
-              <w:br/>
-              <w:t>• Licencia: MIT License (Código abierto institucional FIME UANL)</w:t>
-            </w:r>
-          </w:p>
-        </w:tc>
-      </w:tr>
-    </w:tbl>
     <w:p>
       <w:pPr>
         <w:jc w:val="center"/>
@@ -16569,260 +16564,8 @@
       <w:r>
         <w:drawing>
           <wp:inline xmlns:a="http://schemas.openxmlformats.org/drawingml/2006/main" xmlns:pic="http://schemas.openxmlformats.org/drawingml/2006/picture">
-            <wp:extent cx="4937760" cy="2888397"/>
+            <wp:extent cx="4572000" cy="2286000"/>
             <wp:docPr id="14" name="Picture 14"/>
-            <wp:cNvGraphicFramePr>
-              <a:graphicFrameLocks noChangeAspect="1"/>
-            </wp:cNvGraphicFramePr>
-            <a:graphic>
-              <a:graphicData uri="http://schemas.openxmlformats.org/drawingml/2006/picture">
-                <pic:pic>
-                  <pic:nvPicPr>
-                    <pic:cNvPr id="0" name="Img18_EasyEDA_Esquematico_General_Electronica_Potencia_Matriz_6x6.png"/>
-                    <pic:cNvPicPr/>
-                  </pic:nvPicPr>
-                  <pic:blipFill>
-                    <a:blip r:embed="rId24"/>
-                    <a:stretch>
-                      <a:fillRect/>
-                    </a:stretch>
-                  </pic:blipFill>
-                  <pic:spPr>
-                    <a:xfrm>
-                      <a:off x="0" y="0"/>
-                      <a:ext cx="4937760" cy="2888397"/>
-                    </a:xfrm>
-                    <a:prstGeom prst="rect"/>
-                  </pic:spPr>
-                </pic:pic>
-              </a:graphicData>
-            </a:graphic>
-          </wp:inline>
-        </w:drawing>
-      </w:r>
-    </w:p>
-    <w:p>
-      <w:pPr>
-        <w:spacing w:before="60" w:after="160" w:line="276" w:lineRule="auto"/>
-        <w:jc w:val="center"/>
-      </w:pPr>
-      <w:r>
-        <w:rPr>
-          <w:rFonts w:ascii="Calibri" w:hAnsi="Calibri"/>
-          <w:b/>
-          <w:color w:val="0F2C59"/>
-          <w:sz w:val="18"/>
-        </w:rPr>
-        <w:t xml:space="preserve">Figura 13.10. </w:t>
-      </w:r>
-      <w:r>
-        <w:rPr>
-          <w:rFonts w:ascii="Calibri" w:hAnsi="Calibri"/>
-          <w:i/>
-          <w:color w:val="4B5563"/>
-          <w:sz w:val="18"/>
-        </w:rPr>
-        <w:t>Validación del diagrama esquemático integral en EasyEDA: conexionado de potencia +24V, reguladores de voltaje, matriz MOSFET 6×6 y etapa de relé 30A para el compresor de refrigeración.</w:t>
-      </w:r>
-    </w:p>
-    <w:p>
-      <w:pPr>
-        <w:jc w:val="center"/>
-      </w:pPr>
-      <w:r>
-        <w:drawing>
-          <wp:inline xmlns:a="http://schemas.openxmlformats.org/drawingml/2006/main" xmlns:pic="http://schemas.openxmlformats.org/drawingml/2006/picture">
-            <wp:extent cx="4937760" cy="2285643"/>
-            <wp:docPr id="15" name="Picture 15"/>
-            <wp:cNvGraphicFramePr>
-              <a:graphicFrameLocks noChangeAspect="1"/>
-            </wp:cNvGraphicFramePr>
-            <a:graphic>
-              <a:graphicData uri="http://schemas.openxmlformats.org/drawingml/2006/picture">
-                <pic:pic>
-                  <pic:nvPicPr>
-                    <pic:cNvPr id="0" name="Img17_EasyEDA_Simulador_Web_Interactivo_Matriz_MOSFET_6x6.png"/>
-                    <pic:cNvPicPr/>
-                  </pic:nvPicPr>
-                  <pic:blipFill>
-                    <a:blip r:embed="rId25"/>
-                    <a:stretch>
-                      <a:fillRect/>
-                    </a:stretch>
-                  </pic:blipFill>
-                  <pic:spPr>
-                    <a:xfrm>
-                      <a:off x="0" y="0"/>
-                      <a:ext cx="4937760" cy="2285643"/>
-                    </a:xfrm>
-                    <a:prstGeom prst="rect"/>
-                  </pic:spPr>
-                </pic:pic>
-              </a:graphicData>
-            </a:graphic>
-          </wp:inline>
-        </w:drawing>
-      </w:r>
-    </w:p>
-    <w:p>
-      <w:pPr>
-        <w:spacing w:before="60" w:after="160" w:line="276" w:lineRule="auto"/>
-        <w:jc w:val="center"/>
-      </w:pPr>
-      <w:r>
-        <w:rPr>
-          <w:rFonts w:ascii="Calibri" w:hAnsi="Calibri"/>
-          <w:b/>
-          <w:color w:val="0F2C59"/>
-          <w:sz w:val="18"/>
-        </w:rPr>
-        <w:t xml:space="preserve">Figura 13.11. </w:t>
-      </w:r>
-      <w:r>
-        <w:rPr>
-          <w:rFonts w:ascii="Calibri" w:hAnsi="Calibri"/>
-          <w:i/>
-          <w:color w:val="4B5563"/>
-          <w:sz w:val="18"/>
-        </w:rPr>
-        <w:t>Validación en simulador interactivo web de potencia (potencia.html): conmutación en tiempo real del par MOSFET High-Side / Low-Side para 36 motores y verificación de parámetros de disparo.</w:t>
-      </w:r>
-    </w:p>
-    <w:p>
-      <w:pPr>
-        <w:jc w:val="center"/>
-      </w:pPr>
-      <w:r>
-        <w:drawing>
-          <wp:inline xmlns:a="http://schemas.openxmlformats.org/drawingml/2006/main" xmlns:pic="http://schemas.openxmlformats.org/drawingml/2006/picture">
-            <wp:extent cx="4754880" cy="3263734"/>
-            <wp:docPr id="16" name="Picture 16"/>
-            <wp:cNvGraphicFramePr>
-              <a:graphicFrameLocks noChangeAspect="1"/>
-            </wp:cNvGraphicFramePr>
-            <a:graphic>
-              <a:graphicData uri="http://schemas.openxmlformats.org/drawingml/2006/picture">
-                <pic:pic>
-                  <pic:nvPicPr>
-                    <pic:cNvPr id="0" name="Img20_EasyEDA_Detalle_Etapa_LowSide_Filas_MOSFET_Optoacopladores.png"/>
-                    <pic:cNvPicPr/>
-                  </pic:nvPicPr>
-                  <pic:blipFill>
-                    <a:blip r:embed="rId26"/>
-                    <a:stretch>
-                      <a:fillRect/>
-                    </a:stretch>
-                  </pic:blipFill>
-                  <pic:spPr>
-                    <a:xfrm>
-                      <a:off x="0" y="0"/>
-                      <a:ext cx="4754880" cy="3263734"/>
-                    </a:xfrm>
-                    <a:prstGeom prst="rect"/>
-                  </pic:spPr>
-                </pic:pic>
-              </a:graphicData>
-            </a:graphic>
-          </wp:inline>
-        </w:drawing>
-      </w:r>
-    </w:p>
-    <w:p>
-      <w:pPr>
-        <w:spacing w:before="60" w:after="160" w:line="276" w:lineRule="auto"/>
-        <w:jc w:val="center"/>
-      </w:pPr>
-      <w:r>
-        <w:rPr>
-          <w:rFonts w:ascii="Calibri" w:hAnsi="Calibri"/>
-          <w:b/>
-          <w:color w:val="0F2C59"/>
-          <w:sz w:val="18"/>
-        </w:rPr>
-        <w:t xml:space="preserve">Figura 13.12. </w:t>
-      </w:r>
-      <w:r>
-        <w:rPr>
-          <w:rFonts w:ascii="Calibri" w:hAnsi="Calibri"/>
-          <w:i/>
-          <w:color w:val="4B5563"/>
-          <w:sz w:val="18"/>
-        </w:rPr>
-        <w:t>Detalle de conmutación Low-Side (Filas A a F) en EasyEDA: N-MOSFETs IRLZ44NPBF con optoacopladores PC817C, retorno a tierra GND_PWR y resistores de pulldown.</w:t>
-      </w:r>
-    </w:p>
-    <w:p>
-      <w:pPr>
-        <w:jc w:val="center"/>
-      </w:pPr>
-      <w:r>
-        <w:drawing>
-          <wp:inline xmlns:a="http://schemas.openxmlformats.org/drawingml/2006/main" xmlns:pic="http://schemas.openxmlformats.org/drawingml/2006/picture">
-            <wp:extent cx="4754880" cy="3748187"/>
-            <wp:docPr id="17" name="Picture 17"/>
-            <wp:cNvGraphicFramePr>
-              <a:graphicFrameLocks noChangeAspect="1"/>
-            </wp:cNvGraphicFramePr>
-            <a:graphic>
-              <a:graphicData uri="http://schemas.openxmlformats.org/drawingml/2006/picture">
-                <pic:pic>
-                  <pic:nvPicPr>
-                    <pic:cNvPr id="0" name="Img21_EasyEDA_Detalle_Etapa_Control_Refrigeracion_Compresor_Relay_DS18B20.png"/>
-                    <pic:cNvPicPr/>
-                  </pic:nvPicPr>
-                  <pic:blipFill>
-                    <a:blip r:embed="rId27"/>
-                    <a:stretch>
-                      <a:fillRect/>
-                    </a:stretch>
-                  </pic:blipFill>
-                  <pic:spPr>
-                    <a:xfrm>
-                      <a:off x="0" y="0"/>
-                      <a:ext cx="4754880" cy="3748187"/>
-                    </a:xfrm>
-                    <a:prstGeom prst="rect"/>
-                  </pic:spPr>
-                </pic:pic>
-              </a:graphicData>
-            </a:graphic>
-          </wp:inline>
-        </w:drawing>
-      </w:r>
-    </w:p>
-    <w:p>
-      <w:pPr>
-        <w:spacing w:before="60" w:after="160" w:line="276" w:lineRule="auto"/>
-        <w:jc w:val="center"/>
-      </w:pPr>
-      <w:r>
-        <w:rPr>
-          <w:rFonts w:ascii="Calibri" w:hAnsi="Calibri"/>
-          <w:b/>
-          <w:color w:val="0F2C59"/>
-          <w:sz w:val="18"/>
-        </w:rPr>
-        <w:t xml:space="preserve">Figura 13.13. </w:t>
-      </w:r>
-      <w:r>
-        <w:rPr>
-          <w:rFonts w:ascii="Calibri" w:hAnsi="Calibri"/>
-          <w:i/>
-          <w:color w:val="4B5563"/>
-          <w:sz w:val="18"/>
-        </w:rPr>
-        <w:t>Detalle de control de refrigeración en EasyEDA: circuito de activación con relé SLA-05VDC (30A / 250VAC), supresor snubber RC para absorción inductiva del compresor Embraco y sensor 1-Wire DS18B20.</w:t>
-      </w:r>
-    </w:p>
-    <w:p>
-      <w:pPr>
-        <w:jc w:val="center"/>
-      </w:pPr>
-      <w:r>
-        <w:drawing>
-          <wp:inline xmlns:a="http://schemas.openxmlformats.org/drawingml/2006/main" xmlns:pic="http://schemas.openxmlformats.org/drawingml/2006/picture">
-            <wp:extent cx="4572000" cy="2286000"/>
-            <wp:docPr id="18" name="Picture 18"/>
             <wp:cNvGraphicFramePr>
               <a:graphicFrameLocks noChangeAspect="1"/>
             </wp:cNvGraphicFramePr>
@@ -16834,7 +16577,7 @@
                     <pic:cNvPicPr/>
                   </pic:nvPicPr>
                   <pic:blipFill>
-                    <a:blip r:embed="rId28"/>
+                    <a:blip r:embed="rId24"/>
                     <a:stretch>
                       <a:fillRect/>
                     </a:stretch>
@@ -16885,7 +16628,7 @@
         <w:drawing>
           <wp:inline xmlns:a="http://schemas.openxmlformats.org/drawingml/2006/main" xmlns:pic="http://schemas.openxmlformats.org/drawingml/2006/picture">
             <wp:extent cx="4389120" cy="5685736"/>
-            <wp:docPr id="19" name="Picture 19"/>
+            <wp:docPr id="15" name="Picture 15"/>
             <wp:cNvGraphicFramePr>
               <a:graphicFrameLocks noChangeAspect="1"/>
             </wp:cNvGraphicFramePr>
@@ -16897,7 +16640,7 @@
                     <pic:cNvPicPr/>
                   </pic:nvPicPr>
                   <pic:blipFill>
-                    <a:blip r:embed="rId29"/>
+                    <a:blip r:embed="rId25"/>
                     <a:stretch>
                       <a:fillRect/>
                     </a:stretch>
@@ -16948,7 +16691,7 @@
         <w:drawing>
           <wp:inline xmlns:a="http://schemas.openxmlformats.org/drawingml/2006/main" xmlns:pic="http://schemas.openxmlformats.org/drawingml/2006/picture">
             <wp:extent cx="4572000" cy="2790477"/>
-            <wp:docPr id="20" name="Picture 20"/>
+            <wp:docPr id="16" name="Picture 16"/>
             <wp:cNvGraphicFramePr>
               <a:graphicFrameLocks noChangeAspect="1"/>
             </wp:cNvGraphicFramePr>
@@ -16960,7 +16703,7 @@
                     <pic:cNvPicPr/>
                   </pic:nvPicPr>
                   <pic:blipFill>
-                    <a:blip r:embed="rId30"/>
+                    <a:blip r:embed="rId26"/>
                     <a:stretch>
                       <a:fillRect/>
                     </a:stretch>

</xml_diff>

<commit_message>
docs: reincorporar a Francisco Reyes Santiago en portadas, tablas y diapositiva inicial con division equilibrada de carga tecnica
</commit_message>
<xml_diff>
--- a/01_DOCUMENTOS_ACADEMICOS_FIME/AF2_Presentacion_Resultados_Examen_Ordinario_Paper_Vending_FIME.docx
+++ b/01_DOCUMENTOS_ACADEMICOS_FIME/AF2_Presentacion_Resultados_Examen_Ordinario_Paper_Vending_FIME.docx
@@ -29,12 +29,6 @@
               <w:bottom w:val="none"/>
               <w:right w:val="none"/>
             </w:tcBorders>
-            <w:tcBorders>
-              <w:top w:val="none"/>
-              <w:left w:val="none"/>
-              <w:bottom w:val="none"/>
-              <w:right w:val="none"/>
-            </w:tcBorders>
           </w:tcPr>
           <w:p>
             <w:pPr>
@@ -45,7 +39,7 @@
               <w:drawing>
                 <wp:inline xmlns:a="http://schemas.openxmlformats.org/drawingml/2006/main" xmlns:pic="http://schemas.openxmlformats.org/drawingml/2006/picture">
                   <wp:extent cx="1861457" cy="868680"/>
-                  <wp:docPr id="19" name="Picture 19"/>
+                  <wp:docPr id="21" name="Picture 21"/>
                   <wp:cNvGraphicFramePr>
                     <a:graphicFrameLocks noChangeAspect="1"/>
                   </wp:cNvGraphicFramePr>
@@ -92,12 +86,6 @@
               <w:bottom w:val="none"/>
               <w:right w:val="none"/>
             </w:tcBorders>
-            <w:tcBorders>
-              <w:top w:val="none"/>
-              <w:left w:val="none"/>
-              <w:bottom w:val="none"/>
-              <w:right w:val="none"/>
-            </w:tcBorders>
           </w:tcPr>
           <w:p>
             <w:pPr>
@@ -108,7 +96,7 @@
               <w:drawing>
                 <wp:inline xmlns:a="http://schemas.openxmlformats.org/drawingml/2006/main" xmlns:pic="http://schemas.openxmlformats.org/drawingml/2006/picture">
                   <wp:extent cx="1837592" cy="868680"/>
-                  <wp:docPr id="20" name="Picture 20"/>
+                  <wp:docPr id="22" name="Picture 22"/>
                   <wp:cNvGraphicFramePr>
                     <a:graphicFrameLocks noChangeAspect="1"/>
                   </wp:cNvGraphicFramePr>
@@ -251,13 +239,6 @@
               <w:bottom w:val="single" w:sz="4" w:space="0" w:color="70AD47"/>
               <w:right w:val="single" w:sz="4" w:space="0" w:color="70AD47"/>
             </w:tcBorders>
-            <w:shd w:fill="70AD47"/>
-            <w:tcBorders>
-              <w:top w:val="single" w:sz="4" w:space="0" w:color="70AD47"/>
-              <w:left w:val="single" w:sz="4" w:space="0" w:color="70AD47"/>
-              <w:bottom w:val="single" w:sz="4" w:space="0" w:color="70AD47"/>
-              <w:right w:val="single" w:sz="4" w:space="0" w:color="70AD47"/>
-            </w:tcBorders>
           </w:tcPr>
           <w:p>
             <w:pPr>
@@ -292,13 +273,6 @@
               <w:bottom w:val="single" w:sz="4" w:space="0" w:color="70AD47"/>
               <w:right w:val="single" w:sz="4" w:space="0" w:color="70AD47"/>
             </w:tcBorders>
-            <w:shd w:fill="70AD47"/>
-            <w:tcBorders>
-              <w:top w:val="single" w:sz="4" w:space="0" w:color="70AD47"/>
-              <w:left w:val="single" w:sz="4" w:space="0" w:color="70AD47"/>
-              <w:bottom w:val="single" w:sz="4" w:space="0" w:color="70AD47"/>
-              <w:right w:val="single" w:sz="4" w:space="0" w:color="70AD47"/>
-            </w:tcBorders>
           </w:tcPr>
           <w:p>
             <w:pPr>
@@ -325,13 +299,6 @@
               <w:left w:val="single" w:sz="6" w:space="0" w:color="1B365D"/>
               <w:bottom w:val="single" w:sz="6" w:space="0" w:color="1B365D"/>
               <w:right w:val="single" w:sz="6" w:space="0" w:color="1B365D"/>
-            </w:tcBorders>
-            <w:shd w:fill="70AD47"/>
-            <w:tcBorders>
-              <w:top w:val="single" w:sz="4" w:space="0" w:color="70AD47"/>
-              <w:left w:val="single" w:sz="4" w:space="0" w:color="70AD47"/>
-              <w:bottom w:val="single" w:sz="4" w:space="0" w:color="70AD47"/>
-              <w:right w:val="single" w:sz="4" w:space="0" w:color="70AD47"/>
             </w:tcBorders>
             <w:shd w:fill="70AD47"/>
             <w:tcBorders>
@@ -375,12 +342,6 @@
               <w:bottom w:val="single" w:sz="4" w:space="0" w:color="70AD47"/>
               <w:right w:val="single" w:sz="4" w:space="0" w:color="70AD47"/>
             </w:tcBorders>
-            <w:tcBorders>
-              <w:top w:val="single" w:sz="4" w:space="0" w:color="70AD47"/>
-              <w:left w:val="single" w:sz="4" w:space="0" w:color="70AD47"/>
-              <w:bottom w:val="single" w:sz="4" w:space="0" w:color="70AD47"/>
-              <w:right w:val="single" w:sz="4" w:space="0" w:color="70AD47"/>
-            </w:tcBorders>
           </w:tcPr>
           <w:p>
             <w:pPr>
@@ -413,12 +374,6 @@
               <w:bottom w:val="single" w:sz="4" w:space="0" w:color="70AD47"/>
               <w:right w:val="single" w:sz="4" w:space="0" w:color="70AD47"/>
             </w:tcBorders>
-            <w:tcBorders>
-              <w:top w:val="single" w:sz="4" w:space="0" w:color="70AD47"/>
-              <w:left w:val="single" w:sz="4" w:space="0" w:color="70AD47"/>
-              <w:bottom w:val="single" w:sz="4" w:space="0" w:color="70AD47"/>
-              <w:right w:val="single" w:sz="4" w:space="0" w:color="70AD47"/>
-            </w:tcBorders>
           </w:tcPr>
           <w:p>
             <w:pPr>
@@ -444,12 +399,6 @@
               <w:left w:val="single" w:sz="6" w:space="0" w:color="1B365D"/>
               <w:bottom w:val="single" w:sz="6" w:space="0" w:color="1B365D"/>
               <w:right w:val="single" w:sz="6" w:space="0" w:color="1B365D"/>
-            </w:tcBorders>
-            <w:tcBorders>
-              <w:top w:val="single" w:sz="4" w:space="0" w:color="70AD47"/>
-              <w:left w:val="single" w:sz="4" w:space="0" w:color="70AD47"/>
-              <w:bottom w:val="single" w:sz="4" w:space="0" w:color="70AD47"/>
-              <w:right w:val="single" w:sz="4" w:space="0" w:color="70AD47"/>
             </w:tcBorders>
             <w:tcBorders>
               <w:top w:val="single" w:sz="4" w:space="0" w:color="70AD47"/>
@@ -491,12 +440,6 @@
               <w:bottom w:val="single" w:sz="4" w:space="0" w:color="70AD47"/>
               <w:right w:val="single" w:sz="4" w:space="0" w:color="70AD47"/>
             </w:tcBorders>
-            <w:tcBorders>
-              <w:top w:val="single" w:sz="4" w:space="0" w:color="70AD47"/>
-              <w:left w:val="single" w:sz="4" w:space="0" w:color="70AD47"/>
-              <w:bottom w:val="single" w:sz="4" w:space="0" w:color="70AD47"/>
-              <w:right w:val="single" w:sz="4" w:space="0" w:color="70AD47"/>
-            </w:tcBorders>
           </w:tcPr>
           <w:p>
             <w:pPr>
@@ -522,12 +465,6 @@
               <w:left w:val="single" w:sz="6" w:space="0" w:color="1B365D"/>
               <w:bottom w:val="single" w:sz="6" w:space="0" w:color="1B365D"/>
               <w:right w:val="single" w:sz="6" w:space="0" w:color="1B365D"/>
-            </w:tcBorders>
-            <w:tcBorders>
-              <w:top w:val="single" w:sz="4" w:space="0" w:color="70AD47"/>
-              <w:left w:val="single" w:sz="4" w:space="0" w:color="70AD47"/>
-              <w:bottom w:val="single" w:sz="4" w:space="0" w:color="70AD47"/>
-              <w:right w:val="single" w:sz="4" w:space="0" w:color="70AD47"/>
             </w:tcBorders>
             <w:tcBorders>
               <w:top w:val="single" w:sz="4" w:space="0" w:color="70AD47"/>
@@ -566,6 +503,98 @@
               <w:left w:val="single" w:sz="4" w:space="0" w:color="70AD47"/>
               <w:bottom w:val="single" w:sz="4" w:space="0" w:color="70AD47"/>
               <w:right w:val="single" w:sz="4" w:space="0" w:color="70AD47"/>
+            </w:tcBorders>
+          </w:tcPr>
+          <w:p>
+            <w:pPr>
+              <w:spacing w:before="60" w:after="60"/>
+              <w:jc w:val="left"/>
+            </w:pPr>
+            <w:r>
+              <w:rPr>
+                <w:rFonts w:ascii="Calibri" w:hAnsi="Calibri"/>
+                <w:color w:val="0F172A"/>
+                <w:sz w:val="20"/>
+              </w:rPr>
+              <w:t>IEA</w:t>
+            </w:r>
+          </w:p>
+        </w:tc>
+      </w:tr>
+      <w:tr>
+        <w:tc>
+          <w:tcPr>
+            <w:tcW w:type="dxa" w:w="2592"/>
+            <w:shd w:fill="FFFFFF"/>
+            <w:tcBorders>
+              <w:top w:val="single" w:sz="6" w:space="0" w:color="1B365D"/>
+              <w:left w:val="single" w:sz="6" w:space="0" w:color="1B365D"/>
+              <w:bottom w:val="single" w:sz="6" w:space="0" w:color="1B365D"/>
+              <w:right w:val="single" w:sz="6" w:space="0" w:color="1B365D"/>
+            </w:tcBorders>
+            <w:tcBorders>
+              <w:top w:val="single" w:sz="4" w:space="0" w:color="70AD47"/>
+              <w:left w:val="single" w:sz="4" w:space="0" w:color="70AD47"/>
+              <w:bottom w:val="single" w:sz="4" w:space="0" w:color="70AD47"/>
+              <w:right w:val="single" w:sz="4" w:space="0" w:color="70AD47"/>
+            </w:tcBorders>
+          </w:tcPr>
+          <w:p>
+            <w:pPr>
+              <w:spacing w:before="60" w:after="60"/>
+              <w:jc w:val="left"/>
+            </w:pPr>
+            <w:r>
+              <w:rPr>
+                <w:rFonts w:ascii="Calibri" w:hAnsi="Calibri"/>
+                <w:color w:val="0F172A"/>
+                <w:sz w:val="20"/>
+              </w:rPr>
+              <w:t>1768161</w:t>
+            </w:r>
+          </w:p>
+        </w:tc>
+        <w:tc>
+          <w:tcPr>
+            <w:tcW w:type="dxa" w:w="4608"/>
+            <w:shd w:fill="FFFFFF"/>
+            <w:tcBorders>
+              <w:top w:val="single" w:sz="6" w:space="0" w:color="1B365D"/>
+              <w:left w:val="single" w:sz="6" w:space="0" w:color="1B365D"/>
+              <w:bottom w:val="single" w:sz="6" w:space="0" w:color="1B365D"/>
+              <w:right w:val="single" w:sz="6" w:space="0" w:color="1B365D"/>
+            </w:tcBorders>
+            <w:tcBorders>
+              <w:top w:val="single" w:sz="4" w:space="0" w:color="70AD47"/>
+              <w:left w:val="single" w:sz="4" w:space="0" w:color="70AD47"/>
+              <w:bottom w:val="single" w:sz="4" w:space="0" w:color="70AD47"/>
+              <w:right w:val="single" w:sz="4" w:space="0" w:color="70AD47"/>
+            </w:tcBorders>
+          </w:tcPr>
+          <w:p>
+            <w:pPr>
+              <w:spacing w:before="60" w:after="60"/>
+              <w:jc w:val="left"/>
+            </w:pPr>
+            <w:r>
+              <w:rPr>
+                <w:rFonts w:ascii="Calibri" w:hAnsi="Calibri"/>
+                <w:color w:val="0F172A"/>
+                <w:sz w:val="20"/>
+              </w:rPr>
+              <w:t>Francisco Reyes Santiago</w:t>
+            </w:r>
+          </w:p>
+        </w:tc>
+        <w:tc>
+          <w:tcPr>
+            <w:tcW w:type="dxa" w:w="2160"/>
+            <w:shd w:fill="FFFFFF"/>
+            <w:tcBorders>
+              <w:top w:val="single" w:sz="6" w:space="0" w:color="1B365D"/>
+              <w:left w:val="single" w:sz="6" w:space="0" w:color="1B365D"/>
+              <w:bottom w:val="single" w:sz="6" w:space="0" w:color="1B365D"/>
+              <w:right w:val="single" w:sz="6" w:space="0" w:color="1B365D"/>
             </w:tcBorders>
             <w:tcBorders>
               <w:top w:val="single" w:sz="4" w:space="0" w:color="70AD47"/>
@@ -732,6 +761,35 @@
           <w:sz w:val="21"/>
         </w:rPr>
         <w:t>San Nicolás de los Garza, Nuevo León a 22 de octubre de 2026</w:t>
+        <w:br/>
+      </w:r>
+      <w:r>
+        <w:rPr>
+          <w:rFonts w:ascii="Calibri" w:hAnsi="Calibri"/>
+          <w:b/>
+          <w:color w:val="107846"/>
+          <w:sz w:val="19"/>
+        </w:rPr>
+        <w:t>Repositorio Oficial GitHub (Acceso Abierto vía Enlace): https://github.com/Anubys6/ExpendeX-Smart-Vending-FIME</w:t>
+        <w:br/>
+      </w:r>
+      <w:r>
+        <w:rPr>
+          <w:rFonts w:ascii="Calibri" w:hAnsi="Calibri"/>
+          <w:i/>
+          <w:color w:val="475569"/>
+          <w:sz w:val="17"/>
+        </w:rPr>
+        <w:t>En estricto apego al Programa de Evidencias de Aprendizaje de la U.A. Proyecto de Ingeniería Aplicada (IEAI)</w:t>
+      </w:r>
+      <w:r>
+        <w:rPr>
+          <w:rFonts w:ascii="Calibri" w:hAnsi="Calibri"/>
+          <w:i/>
+          <w:color w:val="475569"/>
+          <w:sz w:val="17"/>
+        </w:rPr>
+        <w:t>En estricto apego al Programa de Evidencias de Aprendizaje de la U.A. Proyecto de Ingeniería Aplicada (IEAI)</w:t>
       </w:r>
       <w:r>
         <w:br w:type="page"/>
@@ -2529,6 +2587,65 @@
                 <w:sz w:val="19"/>
               </w:rPr>
               <w:t>Síntesis del Problema Mecatrónico: Se requiere diseñar, modelar paramétricamente y validar integralmente un micro-restaurante automatizado desatendido capaz de conservar entre 2.0 °C y 4.0 °C (NOM-251-SSA1-2009) y dispensar sin atascos 60 comidas caseras completas ($120.00 MXN) en recipientes cuadrados de tres divisiones y 168 bebidas frías ($25.00 MXN), gobernado por una arquitectura electrónica matricial de bajo costo y control de frescura diaria de 14 horas.</w:t>
+            </w:r>
+          </w:p>
+        </w:tc>
+      </w:tr>
+    </w:tbl>
+    <w:tbl>
+      <w:tblPr>
+        <w:tblW w:type="auto" w:w="0"/>
+        <w:jc w:val="center"/>
+        <w:tblLayout w:type="fixed"/>
+        <w:tblLook w:firstColumn="1" w:firstRow="1" w:lastColumn="0" w:lastRow="0" w:noHBand="0" w:noVBand="1" w:val="04A0"/>
+      </w:tblPr>
+      <w:tblGrid>
+        <w:gridCol w:w="9360"/>
+      </w:tblGrid>
+      <w:tr>
+        <w:trPr>
+          <w:cantSplit/>
+        </w:trPr>
+        <w:tc>
+          <w:tcPr>
+            <w:tcW w:type="dxa" w:w="9360"/>
+            <w:shd w:fill="F1F5F9"/>
+            <w:tcMar>
+              <w:top w:w="140" w:type="dxa"/>
+              <w:left w:w="200" w:type="dxa"/>
+              <w:bottom w:w="140" w:type="dxa"/>
+              <w:right w:w="160" w:type="dxa"/>
+            </w:tcMar>
+            <w:tcBorders>
+              <w:top w:val="none" w:sz="28" w:space="0" w:color="CBD5E1"/>
+              <w:left w:val="single" w:sz="28" w:space="0" w:color="0F2C59"/>
+              <w:bottom w:val="none" w:sz="28" w:space="0" w:color="CBD5E1"/>
+              <w:right w:val="none" w:sz="28" w:space="0" w:color="CBD5E1"/>
+            </w:tcBorders>
+          </w:tcPr>
+          <w:p>
+            <w:pPr>
+              <w:keepLines/>
+              <w:spacing w:line="276" w:lineRule="auto" w:before="0" w:after="0"/>
+            </w:pPr>
+            <w:r>
+              <w:rPr>
+                <w:rFonts w:ascii="Calibri" w:hAnsi="Calibri"/>
+                <w:b/>
+                <w:color w:val="0F2C59"/>
+                <w:sz w:val="20"/>
+              </w:rPr>
+              <w:t>■ MARCO DE REFERENCIA Y EVALUACIÓN INSTITUCIONAL FIME</w:t>
+              <w:br/>
+            </w:r>
+            <w:r>
+              <w:rPr>
+                <w:rFonts w:ascii="Calibri" w:hAnsi="Calibri"/>
+                <w:i/>
+                <w:color w:val="1F2937"/>
+                <w:sz w:val="19"/>
+              </w:rPr>
+              <w:t>El presente reporte técnico de resultados (AF2 - Examen Ordinario) ha sido formulado en estricta concordancia con las pautas y evidencias requeridas en el Programa de Evidencias de Aprendizaje de la Unidad de Aprendizaje: Proyecto de Ingeniería Aplicada (IEAI) de la Facultad de Ingeniería Mecánica y Eléctrica (FIME - UANL), respaldando cada objetivo con modelos experimentales y simulados de alta fidelidad.</w:t>
             </w:r>
           </w:p>
         </w:tc>
@@ -16141,7 +16258,7 @@
                 <w:color w:val="1F2937"/>
                 <w:sz w:val="17"/>
               </w:rPr>
-              <w:t>Integrante de Ingeniería Electrónica y Software</w:t>
+              <w:t>Integrante de Ingenieria de Software y Plataformas Web</w:t>
             </w:r>
           </w:p>
         </w:tc>
@@ -16173,7 +16290,204 @@
                 <w:color w:val="1F2937"/>
                 <w:sz w:val="17"/>
               </w:rPr>
-              <w:t>Desarrollo de las páginas web duales: plataforma web del cliente (quiosco interactivo táctil de 10.1" con catálogo nutricional NOM-051, combos inteligentes y pasarela de cobro digital QR de Mercado Pago) y plataforma web del dueño (panel administrativo con telemetría y gestor multi-ranura con rotación FIFO); y simulación y diseño de electrónica de potencia y ruteo PCB en EasyEDA (matriz MOSFET 6×6, optoaislamiento PC817C, supresores Schottky 1N5822 y dimensionamiento térmico según IPC-2221B).</w:t>
+              <w:t>Desarrollo integral de las plataformas web duales: plataforma web del cliente (quiosco interactivo tactil de 10.1 pulgadas con interfaz Next.js/Tailwind CSS, catalogo nutricional bajo norma NOM-051, combos inteligentes y pasarela de cobro digital con codigo QR dinamico de Mercado Pago) y plataforma web del dueno (panel administrativo con telemetria en tiempo real, gestion multi-ranura e inventario con algoritmo de rotacion FIFO).</w:t>
+            </w:r>
+          </w:p>
+        </w:tc>
+      </w:tr>
+      <w:tr>
+        <w:trPr>
+          <w:cantSplit/>
+        </w:trPr>
+        <w:tc>
+          <w:tcPr>
+            <w:tcW w:type="dxa" w:w="2160"/>
+            <w:shd w:fill="F8FAFC"/>
+            <w:tcMar>
+              <w:top w:w="90" w:type="dxa"/>
+              <w:left w:w="100" w:type="dxa"/>
+              <w:bottom w:w="90" w:type="dxa"/>
+              <w:right w:w="100" w:type="dxa"/>
+            </w:tcMar>
+            <w:tcBorders>
+              <w:top w:val="single" w:sz="4" w:space="0" w:color="CBD5E1"/>
+              <w:left w:val="single" w:sz="4" w:space="0" w:color="CBD5E1"/>
+              <w:bottom w:val="single" w:sz="4" w:space="0" w:color="CBD5E1"/>
+              <w:right w:val="single" w:sz="4" w:space="0" w:color="CBD5E1"/>
+            </w:tcBorders>
+          </w:tcPr>
+          <w:p>
+            <w:pPr>
+              <w:keepLines/>
+              <w:jc w:val="center"/>
+            </w:pPr>
+            <w:r>
+              <w:rPr>
+                <w:rFonts w:ascii="Calibri" w:hAnsi="Calibri"/>
+                <w:color w:val="1F2937"/>
+                <w:sz w:val="17"/>
+              </w:rPr>
+              <w:t>Francisco Reyes Santiago</w:t>
+            </w:r>
+          </w:p>
+        </w:tc>
+        <w:tc>
+          <w:tcPr>
+            <w:tcW w:type="dxa" w:w="1368"/>
+            <w:shd w:fill="F8FAFC"/>
+            <w:tcMar>
+              <w:top w:w="90" w:type="dxa"/>
+              <w:left w:w="100" w:type="dxa"/>
+              <w:bottom w:w="90" w:type="dxa"/>
+              <w:right w:w="100" w:type="dxa"/>
+            </w:tcMar>
+            <w:tcBorders>
+              <w:top w:val="single" w:sz="4" w:space="0" w:color="CBD5E1"/>
+              <w:left w:val="single" w:sz="4" w:space="0" w:color="CBD5E1"/>
+              <w:bottom w:val="single" w:sz="4" w:space="0" w:color="CBD5E1"/>
+              <w:right w:val="single" w:sz="4" w:space="0" w:color="CBD5E1"/>
+            </w:tcBorders>
+          </w:tcPr>
+          <w:p>
+            <w:pPr>
+              <w:keepLines/>
+              <w:jc w:val="left"/>
+            </w:pPr>
+            <w:r>
+              <w:rPr>
+                <w:rFonts w:ascii="Calibri" w:hAnsi="Calibri"/>
+                <w:color w:val="1F2937"/>
+                <w:sz w:val="17"/>
+              </w:rPr>
+              <w:t>1768161 (IEA)</w:t>
+            </w:r>
+          </w:p>
+        </w:tc>
+        <w:tc>
+          <w:tcPr>
+            <w:tcW w:type="dxa" w:w="2088"/>
+            <w:shd w:fill="F8FAFC"/>
+            <w:tcMar>
+              <w:top w:w="90" w:type="dxa"/>
+              <w:left w:w="100" w:type="dxa"/>
+              <w:bottom w:w="90" w:type="dxa"/>
+              <w:right w:w="100" w:type="dxa"/>
+            </w:tcMar>
+            <w:tcBorders>
+              <w:top w:val="single" w:sz="4" w:space="0" w:color="CBD5E1"/>
+              <w:left w:val="single" w:sz="4" w:space="0" w:color="CBD5E1"/>
+              <w:bottom w:val="single" w:sz="4" w:space="0" w:color="CBD5E1"/>
+              <w:right w:val="single" w:sz="4" w:space="0" w:color="CBD5E1"/>
+            </w:tcBorders>
+          </w:tcPr>
+          <w:p>
+            <w:pPr>
+              <w:keepLines/>
+              <w:jc w:val="left"/>
+            </w:pPr>
+            <w:r>
+              <w:rPr>
+                <w:rFonts w:ascii="Calibri" w:hAnsi="Calibri"/>
+                <w:color w:val="1F2937"/>
+                <w:sz w:val="17"/>
+              </w:rPr>
+              <w:t>Integrante de Ingenieria Electronica (Potencia y Digital)</w:t>
+            </w:r>
+          </w:p>
+        </w:tc>
+        <w:tc>
+          <w:tcPr>
+            <w:tcW w:type="dxa" w:w="3744"/>
+            <w:shd w:fill="F8FAFC"/>
+            <w:tcMar>
+              <w:top w:w="90" w:type="dxa"/>
+              <w:left w:w="100" w:type="dxa"/>
+              <w:bottom w:w="90" w:type="dxa"/>
+              <w:right w:w="100" w:type="dxa"/>
+            </w:tcMar>
+            <w:tcBorders>
+              <w:top w:val="single" w:sz="4" w:space="0" w:color="CBD5E1"/>
+              <w:left w:val="single" w:sz="4" w:space="0" w:color="CBD5E1"/>
+              <w:bottom w:val="single" w:sz="4" w:space="0" w:color="CBD5E1"/>
+              <w:right w:val="single" w:sz="4" w:space="0" w:color="CBD5E1"/>
+            </w:tcBorders>
+          </w:tcPr>
+          <w:p>
+            <w:pPr>
+              <w:keepLines/>
+              <w:jc w:val="left"/>
+            </w:pPr>
+            <w:r>
+              <w:rPr>
+                <w:rFonts w:ascii="Calibri" w:hAnsi="Calibri"/>
+                <w:color w:val="1F2937"/>
+                <w:sz w:val="17"/>
+              </w:rPr>
+              <w:t>Diseno y simulacion de la etapa de potencia y ruteo PCB en EasyEDA (matriz MOSFET 6x6 con conmutacion de 36 motorreductores planetarios de 24V DC mediante 12 lineas de control GPIO, optoaislamiento PC817C de 5,000 V RMS, supresion de transitorios Back-EMF con diodos Flyback 1N4007 y dimensionamiento termico segun norma IPC-2221B); y simulacion colaborativa de circuitos de electronica digital de soporte.</w:t>
+            </w:r>
+          </w:p>
+        </w:tc>
+      </w:tr>
+    </w:tbl>
+    <w:tbl>
+      <w:tblPr>
+        <w:tblW w:type="auto" w:w="0"/>
+        <w:jc w:val="center"/>
+        <w:tblLayout w:type="fixed"/>
+        <w:tblLook w:firstColumn="1" w:firstRow="1" w:lastColumn="0" w:lastRow="0" w:noHBand="0" w:noVBand="1" w:val="04A0"/>
+      </w:tblPr>
+      <w:tblGrid>
+        <w:gridCol w:w="9360"/>
+      </w:tblGrid>
+      <w:tr>
+        <w:trPr>
+          <w:cantSplit/>
+        </w:trPr>
+        <w:tc>
+          <w:tcPr>
+            <w:tcW w:type="dxa" w:w="9360"/>
+            <w:shd w:fill="F1F5F9"/>
+            <w:tcMar>
+              <w:top w:w="140" w:type="dxa"/>
+              <w:left w:w="200" w:type="dxa"/>
+              <w:bottom w:w="140" w:type="dxa"/>
+              <w:right w:w="160" w:type="dxa"/>
+            </w:tcMar>
+            <w:tcBorders>
+              <w:top w:val="none" w:sz="28" w:space="0" w:color="CBD5E1"/>
+              <w:left w:val="single" w:sz="28" w:space="0" w:color="0F2C59"/>
+              <w:bottom w:val="none" w:sz="28" w:space="0" w:color="CBD5E1"/>
+              <w:right w:val="none" w:sz="28" w:space="0" w:color="CBD5E1"/>
+            </w:tcBorders>
+          </w:tcPr>
+          <w:p>
+            <w:pPr>
+              <w:keepLines/>
+              <w:spacing w:line="276" w:lineRule="auto" w:before="0" w:after="0"/>
+            </w:pPr>
+            <w:r>
+              <w:rPr>
+                <w:rFonts w:ascii="Calibri" w:hAnsi="Calibri"/>
+                <w:b/>
+                <w:color w:val="0F2C59"/>
+                <w:sz w:val="20"/>
+              </w:rPr>
+              <w:t>■ REPOSITORIO OFICIAL DEL PROYECTO EN GITHUB (ACCESO ABIERTO VÍA ENLACE)</w:t>
+              <w:br/>
+            </w:r>
+            <w:r>
+              <w:rPr>
+                <w:rFonts w:ascii="Calibri" w:hAnsi="Calibri"/>
+                <w:i/>
+                <w:color w:val="1F2937"/>
+                <w:sz w:val="19"/>
+              </w:rPr>
+              <w:t>En estricto apego a las directrices de validación técnica y evidencia experimental del Programa de Evidencias de Aprendizaje de la Unidad de Aprendizaje: Proyecto de Ingeniería Aplicada (IEAI) de la Facultad de Ingeniería Mecánica y Eléctrica (FIME - UANL), el ecosistema completo de diseño del proyecto ExpendeX —incluyendo los modelos tridimensionales CAD paramétricos en Autodesk Fusion 360, esquemáticos y diseño de circuito impreso (PCB) en EasyEDA, código fuente del firmware en C++ para ESP32 FreeRTOS (Wokwi / PlatformIO), la suite web del quiosco y panel administrativo, y la documentación académica completa de las 5 Actividades Fundamentales— se encuentra configurado con acceso público directo vía enlace para que cualquier docente, evaluador o estudiante con el hipervínculo acceda de inmediato sin barreras de autenticación:</w:t>
+              <w:br/>
+              <w:br/>
+              <w:t>• URL Oficial (Acceso Abierto vía Enlace): https://github.com/Anubys6/ExpendeX-Smart-Vending-FIME</w:t>
+              <w:br/>
+              <w:t>• Licencia: MIT License (Código abierto institucional FIME UANL)</w:t>
             </w:r>
           </w:p>
         </w:tc>
@@ -16564,8 +16878,260 @@
       <w:r>
         <w:drawing>
           <wp:inline xmlns:a="http://schemas.openxmlformats.org/drawingml/2006/main" xmlns:pic="http://schemas.openxmlformats.org/drawingml/2006/picture">
+            <wp:extent cx="4937760" cy="2888397"/>
+            <wp:docPr id="14" name="Picture 14"/>
+            <wp:cNvGraphicFramePr>
+              <a:graphicFrameLocks noChangeAspect="1"/>
+            </wp:cNvGraphicFramePr>
+            <a:graphic>
+              <a:graphicData uri="http://schemas.openxmlformats.org/drawingml/2006/picture">
+                <pic:pic>
+                  <pic:nvPicPr>
+                    <pic:cNvPr id="0" name="Img18_EasyEDA_Esquematico_General_Electronica_Potencia_Matriz_6x6.png"/>
+                    <pic:cNvPicPr/>
+                  </pic:nvPicPr>
+                  <pic:blipFill>
+                    <a:blip r:embed="rId24"/>
+                    <a:stretch>
+                      <a:fillRect/>
+                    </a:stretch>
+                  </pic:blipFill>
+                  <pic:spPr>
+                    <a:xfrm>
+                      <a:off x="0" y="0"/>
+                      <a:ext cx="4937760" cy="2888397"/>
+                    </a:xfrm>
+                    <a:prstGeom prst="rect"/>
+                  </pic:spPr>
+                </pic:pic>
+              </a:graphicData>
+            </a:graphic>
+          </wp:inline>
+        </w:drawing>
+      </w:r>
+    </w:p>
+    <w:p>
+      <w:pPr>
+        <w:spacing w:before="60" w:after="160" w:line="276" w:lineRule="auto"/>
+        <w:jc w:val="center"/>
+      </w:pPr>
+      <w:r>
+        <w:rPr>
+          <w:rFonts w:ascii="Calibri" w:hAnsi="Calibri"/>
+          <w:b/>
+          <w:color w:val="0F2C59"/>
+          <w:sz w:val="18"/>
+        </w:rPr>
+        <w:t xml:space="preserve">Figura 13.10. </w:t>
+      </w:r>
+      <w:r>
+        <w:rPr>
+          <w:rFonts w:ascii="Calibri" w:hAnsi="Calibri"/>
+          <w:i/>
+          <w:color w:val="4B5563"/>
+          <w:sz w:val="18"/>
+        </w:rPr>
+        <w:t>Validación del diagrama esquemático integral en EasyEDA: conexionado de potencia +24V, reguladores de voltaje, matriz MOSFET 6×6 y etapa de relé 30A para el compresor de refrigeración.</w:t>
+      </w:r>
+    </w:p>
+    <w:p>
+      <w:pPr>
+        <w:jc w:val="center"/>
+      </w:pPr>
+      <w:r>
+        <w:drawing>
+          <wp:inline xmlns:a="http://schemas.openxmlformats.org/drawingml/2006/main" xmlns:pic="http://schemas.openxmlformats.org/drawingml/2006/picture">
+            <wp:extent cx="4937760" cy="2285643"/>
+            <wp:docPr id="15" name="Picture 15"/>
+            <wp:cNvGraphicFramePr>
+              <a:graphicFrameLocks noChangeAspect="1"/>
+            </wp:cNvGraphicFramePr>
+            <a:graphic>
+              <a:graphicData uri="http://schemas.openxmlformats.org/drawingml/2006/picture">
+                <pic:pic>
+                  <pic:nvPicPr>
+                    <pic:cNvPr id="0" name="Img17_EasyEDA_Simulador_Web_Interactivo_Matriz_MOSFET_6x6.png"/>
+                    <pic:cNvPicPr/>
+                  </pic:nvPicPr>
+                  <pic:blipFill>
+                    <a:blip r:embed="rId25"/>
+                    <a:stretch>
+                      <a:fillRect/>
+                    </a:stretch>
+                  </pic:blipFill>
+                  <pic:spPr>
+                    <a:xfrm>
+                      <a:off x="0" y="0"/>
+                      <a:ext cx="4937760" cy="2285643"/>
+                    </a:xfrm>
+                    <a:prstGeom prst="rect"/>
+                  </pic:spPr>
+                </pic:pic>
+              </a:graphicData>
+            </a:graphic>
+          </wp:inline>
+        </w:drawing>
+      </w:r>
+    </w:p>
+    <w:p>
+      <w:pPr>
+        <w:spacing w:before="60" w:after="160" w:line="276" w:lineRule="auto"/>
+        <w:jc w:val="center"/>
+      </w:pPr>
+      <w:r>
+        <w:rPr>
+          <w:rFonts w:ascii="Calibri" w:hAnsi="Calibri"/>
+          <w:b/>
+          <w:color w:val="0F2C59"/>
+          <w:sz w:val="18"/>
+        </w:rPr>
+        <w:t xml:space="preserve">Figura 13.11. </w:t>
+      </w:r>
+      <w:r>
+        <w:rPr>
+          <w:rFonts w:ascii="Calibri" w:hAnsi="Calibri"/>
+          <w:i/>
+          <w:color w:val="4B5563"/>
+          <w:sz w:val="18"/>
+        </w:rPr>
+        <w:t>Validación en simulador interactivo web de potencia (potencia.html): conmutación en tiempo real del par MOSFET High-Side / Low-Side para 36 motores y verificación de parámetros de disparo.</w:t>
+      </w:r>
+    </w:p>
+    <w:p>
+      <w:pPr>
+        <w:jc w:val="center"/>
+      </w:pPr>
+      <w:r>
+        <w:drawing>
+          <wp:inline xmlns:a="http://schemas.openxmlformats.org/drawingml/2006/main" xmlns:pic="http://schemas.openxmlformats.org/drawingml/2006/picture">
+            <wp:extent cx="4754880" cy="3263734"/>
+            <wp:docPr id="16" name="Picture 16"/>
+            <wp:cNvGraphicFramePr>
+              <a:graphicFrameLocks noChangeAspect="1"/>
+            </wp:cNvGraphicFramePr>
+            <a:graphic>
+              <a:graphicData uri="http://schemas.openxmlformats.org/drawingml/2006/picture">
+                <pic:pic>
+                  <pic:nvPicPr>
+                    <pic:cNvPr id="0" name="Img20_EasyEDA_Detalle_Etapa_LowSide_Filas_MOSFET_Optoacopladores.png"/>
+                    <pic:cNvPicPr/>
+                  </pic:nvPicPr>
+                  <pic:blipFill>
+                    <a:blip r:embed="rId26"/>
+                    <a:stretch>
+                      <a:fillRect/>
+                    </a:stretch>
+                  </pic:blipFill>
+                  <pic:spPr>
+                    <a:xfrm>
+                      <a:off x="0" y="0"/>
+                      <a:ext cx="4754880" cy="3263734"/>
+                    </a:xfrm>
+                    <a:prstGeom prst="rect"/>
+                  </pic:spPr>
+                </pic:pic>
+              </a:graphicData>
+            </a:graphic>
+          </wp:inline>
+        </w:drawing>
+      </w:r>
+    </w:p>
+    <w:p>
+      <w:pPr>
+        <w:spacing w:before="60" w:after="160" w:line="276" w:lineRule="auto"/>
+        <w:jc w:val="center"/>
+      </w:pPr>
+      <w:r>
+        <w:rPr>
+          <w:rFonts w:ascii="Calibri" w:hAnsi="Calibri"/>
+          <w:b/>
+          <w:color w:val="0F2C59"/>
+          <w:sz w:val="18"/>
+        </w:rPr>
+        <w:t xml:space="preserve">Figura 13.12. </w:t>
+      </w:r>
+      <w:r>
+        <w:rPr>
+          <w:rFonts w:ascii="Calibri" w:hAnsi="Calibri"/>
+          <w:i/>
+          <w:color w:val="4B5563"/>
+          <w:sz w:val="18"/>
+        </w:rPr>
+        <w:t>Detalle de conmutación Low-Side (Filas A a F) en EasyEDA: N-MOSFETs IRLZ44NPBF con optoacopladores PC817C, retorno a tierra GND_PWR y resistores de pulldown.</w:t>
+      </w:r>
+    </w:p>
+    <w:p>
+      <w:pPr>
+        <w:jc w:val="center"/>
+      </w:pPr>
+      <w:r>
+        <w:drawing>
+          <wp:inline xmlns:a="http://schemas.openxmlformats.org/drawingml/2006/main" xmlns:pic="http://schemas.openxmlformats.org/drawingml/2006/picture">
+            <wp:extent cx="4754880" cy="3748187"/>
+            <wp:docPr id="17" name="Picture 17"/>
+            <wp:cNvGraphicFramePr>
+              <a:graphicFrameLocks noChangeAspect="1"/>
+            </wp:cNvGraphicFramePr>
+            <a:graphic>
+              <a:graphicData uri="http://schemas.openxmlformats.org/drawingml/2006/picture">
+                <pic:pic>
+                  <pic:nvPicPr>
+                    <pic:cNvPr id="0" name="Img21_EasyEDA_Detalle_Etapa_Control_Refrigeracion_Compresor_Relay_DS18B20.png"/>
+                    <pic:cNvPicPr/>
+                  </pic:nvPicPr>
+                  <pic:blipFill>
+                    <a:blip r:embed="rId27"/>
+                    <a:stretch>
+                      <a:fillRect/>
+                    </a:stretch>
+                  </pic:blipFill>
+                  <pic:spPr>
+                    <a:xfrm>
+                      <a:off x="0" y="0"/>
+                      <a:ext cx="4754880" cy="3748187"/>
+                    </a:xfrm>
+                    <a:prstGeom prst="rect"/>
+                  </pic:spPr>
+                </pic:pic>
+              </a:graphicData>
+            </a:graphic>
+          </wp:inline>
+        </w:drawing>
+      </w:r>
+    </w:p>
+    <w:p>
+      <w:pPr>
+        <w:spacing w:before="60" w:after="160" w:line="276" w:lineRule="auto"/>
+        <w:jc w:val="center"/>
+      </w:pPr>
+      <w:r>
+        <w:rPr>
+          <w:rFonts w:ascii="Calibri" w:hAnsi="Calibri"/>
+          <w:b/>
+          <w:color w:val="0F2C59"/>
+          <w:sz w:val="18"/>
+        </w:rPr>
+        <w:t xml:space="preserve">Figura 13.13. </w:t>
+      </w:r>
+      <w:r>
+        <w:rPr>
+          <w:rFonts w:ascii="Calibri" w:hAnsi="Calibri"/>
+          <w:i/>
+          <w:color w:val="4B5563"/>
+          <w:sz w:val="18"/>
+        </w:rPr>
+        <w:t>Detalle de control de refrigeración en EasyEDA: circuito de activación con relé SLA-05VDC (30A / 250VAC), supresor snubber RC para absorción inductiva del compresor Embraco y sensor 1-Wire DS18B20.</w:t>
+      </w:r>
+    </w:p>
+    <w:p>
+      <w:pPr>
+        <w:jc w:val="center"/>
+      </w:pPr>
+      <w:r>
+        <w:drawing>
+          <wp:inline xmlns:a="http://schemas.openxmlformats.org/drawingml/2006/main" xmlns:pic="http://schemas.openxmlformats.org/drawingml/2006/picture">
             <wp:extent cx="4572000" cy="2286000"/>
-            <wp:docPr id="14" name="Picture 14"/>
+            <wp:docPr id="18" name="Picture 18"/>
             <wp:cNvGraphicFramePr>
               <a:graphicFrameLocks noChangeAspect="1"/>
             </wp:cNvGraphicFramePr>
@@ -16577,7 +17143,7 @@
                     <pic:cNvPicPr/>
                   </pic:nvPicPr>
                   <pic:blipFill>
-                    <a:blip r:embed="rId24"/>
+                    <a:blip r:embed="rId28"/>
                     <a:stretch>
                       <a:fillRect/>
                     </a:stretch>
@@ -16628,7 +17194,7 @@
         <w:drawing>
           <wp:inline xmlns:a="http://schemas.openxmlformats.org/drawingml/2006/main" xmlns:pic="http://schemas.openxmlformats.org/drawingml/2006/picture">
             <wp:extent cx="4389120" cy="5685736"/>
-            <wp:docPr id="15" name="Picture 15"/>
+            <wp:docPr id="19" name="Picture 19"/>
             <wp:cNvGraphicFramePr>
               <a:graphicFrameLocks noChangeAspect="1"/>
             </wp:cNvGraphicFramePr>
@@ -16640,7 +17206,7 @@
                     <pic:cNvPicPr/>
                   </pic:nvPicPr>
                   <pic:blipFill>
-                    <a:blip r:embed="rId25"/>
+                    <a:blip r:embed="rId29"/>
                     <a:stretch>
                       <a:fillRect/>
                     </a:stretch>
@@ -16691,7 +17257,7 @@
         <w:drawing>
           <wp:inline xmlns:a="http://schemas.openxmlformats.org/drawingml/2006/main" xmlns:pic="http://schemas.openxmlformats.org/drawingml/2006/picture">
             <wp:extent cx="4572000" cy="2790477"/>
-            <wp:docPr id="16" name="Picture 16"/>
+            <wp:docPr id="20" name="Picture 20"/>
             <wp:cNvGraphicFramePr>
               <a:graphicFrameLocks noChangeAspect="1"/>
             </wp:cNvGraphicFramePr>
@@ -16703,7 +17269,7 @@
                     <pic:cNvPicPr/>
                   </pic:nvPicPr>
                   <pic:blipFill>
-                    <a:blip r:embed="rId26"/>
+                    <a:blip r:embed="rId30"/>
                     <a:stretch>
                       <a:fillRect/>
                     </a:stretch>

</xml_diff>

<commit_message>
fix(portadas): eliminar coordinacion y diseno tecnico, anadir repositorio en portada, remover llamadas internas y actualizar presentacion
</commit_message>
<xml_diff>
--- a/01_DOCUMENTOS_ACADEMICOS_FIME/AF2_Presentacion_Resultados_Examen_Ordinario_Paper_Vending_FIME.docx
+++ b/01_DOCUMENTOS_ACADEMICOS_FIME/AF2_Presentacion_Resultados_Examen_Ordinario_Paper_Vending_FIME.docx
@@ -132,14 +132,14 @@
     </w:tbl>
     <w:p>
       <w:pPr>
-        <w:spacing w:before="480" w:after="80"/>
+        <w:spacing w:before="280" w:after="40"/>
         <w:jc w:val="center"/>
       </w:pPr>
+      <w:r/>
       <w:r>
         <w:rPr>
           <w:rFonts w:ascii="Calibri" w:hAnsi="Calibri"/>
           <w:b/>
-          <w:i/>
           <w:color w:val="0F2C59"/>
           <w:sz w:val="26"/>
         </w:rPr>
@@ -150,34 +150,22 @@
         <w:rPr>
           <w:rFonts w:ascii="Calibri" w:hAnsi="Calibri"/>
           <w:b/>
-          <w:i/>
           <w:color w:val="1E40AF"/>
           <w:sz w:val="23"/>
         </w:rPr>
         <w:t>FACULTAD DE INGENIERÍA MECÁNICA Y ELÉCTRICA</w:t>
-        <w:br/>
       </w:r>
+    </w:p>
+    <w:p>
+      <w:pPr>
+        <w:spacing w:before="280" w:after="40"/>
+        <w:jc w:val="center"/>
+      </w:pPr>
+      <w:r/>
       <w:r>
         <w:rPr>
           <w:rFonts w:ascii="Calibri" w:hAnsi="Calibri"/>
           <w:b/>
-          <w:i/>
-          <w:color w:val="4B5563"/>
-          <w:sz w:val="20"/>
-        </w:rPr>
-        <w:t>COORDINACIÓN DE INGENIERÍA EN ELECTRÓNICA Y AUTOMATIZACIÓN (IEA)</w:t>
-      </w:r>
-    </w:p>
-    <w:p>
-      <w:pPr>
-        <w:spacing w:before="400" w:after="80"/>
-        <w:jc w:val="center"/>
-      </w:pPr>
-      <w:r>
-        <w:rPr>
-          <w:rFonts w:ascii="Calibri" w:hAnsi="Calibri"/>
-          <w:b/>
-          <w:i/>
           <w:color w:val="1F2937"/>
           <w:sz w:val="23"/>
         </w:rPr>
@@ -188,7 +176,6 @@
         <w:rPr>
           <w:rFonts w:ascii="Calibri" w:hAnsi="Calibri"/>
           <w:b/>
-          <w:i/>
           <w:color w:val="0F2C59"/>
           <w:sz w:val="23"/>
         </w:rPr>
@@ -202,10 +189,11 @@
         <w:rPr>
           <w:rFonts w:ascii="Calibri" w:hAnsi="Calibri"/>
           <w:b/>
-          <w:color w:val="0F2C59"/>
-          <w:sz w:val="22"/>
+          <w:i/>
+          <w:color w:val="1E293B"/>
+          <w:sz w:val="19"/>
         </w:rPr>
-        <w:t>«REPORTE TÉCNICO DE RESULTADOS, ANÁLISIS DE CONCORDANCIA TEÓRICO-SIMULADO-EXPERIMENTAL Y DEMOSTRACIÓN FUNCIONAL DEL MICRO-RESTAURANTE AUTOMATIZADO DESATENDIDO EXPENDEX (36 CANALES MIXTOS 1+4+1 CON MOTORREDUCTORES 24V DC, RECIPIENTES CUADRADOS DE 3 DIVISIONES Y PANTALLA TÁCTIL DE 10.1 PULGADAS)»</w:t>
+        <w:t>«REPORTE TÉCNICO DE RESULTADOS, ANÁLISIS DE CONCORDANCIA TEÓRICO-SIMULADO-EXPERIMENTAL Y DEMOSTRACIÓN FUNCIONAL DE LA MÁQUINA AUTOMATIZADA HÍBRIDA EXPENDEX (36 CANALES MIXTOS 1+4+1 CON MOTORREDUCTORES 24V DC, RECIPIENTES CUADRADOS DE 3 DIVISIONES Y PANTALLA TÁCTIL DE 10.1 PULGADAS)»</w:t>
       </w:r>
     </w:p>
     <w:tbl>
@@ -751,13 +739,14 @@
     </w:p>
     <w:p>
       <w:pPr>
-        <w:spacing w:before="160" w:after="0"/>
+        <w:spacing w:before="200" w:after="0"/>
         <w:jc w:val="center"/>
       </w:pPr>
       <w:r/>
       <w:r>
         <w:rPr>
           <w:rFonts w:ascii="Calibri" w:hAnsi="Calibri"/>
+          <w:color w:val="0F172A"/>
           <w:sz w:val="21"/>
         </w:rPr>
         <w:t>San Nicolás de los Garza, Nuevo León a 22 de octubre de 2026</w:t>
@@ -768,9 +757,18 @@
           <w:rFonts w:ascii="Calibri" w:hAnsi="Calibri"/>
           <w:b/>
           <w:color w:val="107846"/>
-          <w:sz w:val="19"/>
+          <w:sz w:val="20"/>
         </w:rPr>
-        <w:t>Repositorio Oficial GitHub (Acceso Abierto vía Enlace): https://github.com/Anubys6/ExpendeX-Smart-Vending-FIME</w:t>
+        <w:t xml:space="preserve">Repositorio Oficial GitHub (Acceso Abierto): </w:t>
+      </w:r>
+      <w:r>
+        <w:rPr>
+          <w:rFonts w:ascii="Calibri" w:hAnsi="Calibri"/>
+          <w:b/>
+          <w:color w:val="0678B4"/>
+          <w:sz w:val="20"/>
+        </w:rPr>
+        <w:t>https://github.com/Anubys6/ExpendeX-Smart-Vending-FIME</w:t>
         <w:br/>
       </w:r>
       <w:r>
@@ -780,19 +778,7 @@
           <w:color w:val="475569"/>
           <w:sz w:val="17"/>
         </w:rPr>
-        <w:t>En estricto apego al Programa de Evidencias de Aprendizaje de la U.A. Proyecto de Ingeniería Aplicada (IEAI)</w:t>
-      </w:r>
-      <w:r>
-        <w:rPr>
-          <w:rFonts w:ascii="Calibri" w:hAnsi="Calibri"/>
-          <w:i/>
-          <w:color w:val="475569"/>
-          <w:sz w:val="17"/>
-        </w:rPr>
-        <w:t>En estricto apego al Programa de Evidencias de Aprendizaje de la U.A. Proyecto de Ingeniería Aplicada (IEAI)</w:t>
-      </w:r>
-      <w:r>
-        <w:br w:type="page"/>
+        <w:t>En estricto apego al Programa de Evidencias de Aprendizaje de la U.A. Proyecto de Ingeniería Aplicada (IEA)</w:t>
       </w:r>
     </w:p>
     <w:p>
@@ -16429,70 +16415,6 @@
         </w:tc>
       </w:tr>
     </w:tbl>
-    <w:tbl>
-      <w:tblPr>
-        <w:tblW w:type="auto" w:w="0"/>
-        <w:jc w:val="center"/>
-        <w:tblLayout w:type="fixed"/>
-        <w:tblLook w:firstColumn="1" w:firstRow="1" w:lastColumn="0" w:lastRow="0" w:noHBand="0" w:noVBand="1" w:val="04A0"/>
-      </w:tblPr>
-      <w:tblGrid>
-        <w:gridCol w:w="9360"/>
-      </w:tblGrid>
-      <w:tr>
-        <w:trPr>
-          <w:cantSplit/>
-        </w:trPr>
-        <w:tc>
-          <w:tcPr>
-            <w:tcW w:type="dxa" w:w="9360"/>
-            <w:shd w:fill="F1F5F9"/>
-            <w:tcMar>
-              <w:top w:w="140" w:type="dxa"/>
-              <w:left w:w="200" w:type="dxa"/>
-              <w:bottom w:w="140" w:type="dxa"/>
-              <w:right w:w="160" w:type="dxa"/>
-            </w:tcMar>
-            <w:tcBorders>
-              <w:top w:val="none" w:sz="28" w:space="0" w:color="CBD5E1"/>
-              <w:left w:val="single" w:sz="28" w:space="0" w:color="0F2C59"/>
-              <w:bottom w:val="none" w:sz="28" w:space="0" w:color="CBD5E1"/>
-              <w:right w:val="none" w:sz="28" w:space="0" w:color="CBD5E1"/>
-            </w:tcBorders>
-          </w:tcPr>
-          <w:p>
-            <w:pPr>
-              <w:keepLines/>
-              <w:spacing w:line="276" w:lineRule="auto" w:before="0" w:after="0"/>
-            </w:pPr>
-            <w:r>
-              <w:rPr>
-                <w:rFonts w:ascii="Calibri" w:hAnsi="Calibri"/>
-                <w:b/>
-                <w:color w:val="0F2C59"/>
-                <w:sz w:val="20"/>
-              </w:rPr>
-              <w:t>■ REPOSITORIO OFICIAL DEL PROYECTO EN GITHUB (ACCESO ABIERTO VÍA ENLACE)</w:t>
-              <w:br/>
-            </w:r>
-            <w:r>
-              <w:rPr>
-                <w:rFonts w:ascii="Calibri" w:hAnsi="Calibri"/>
-                <w:i/>
-                <w:color w:val="1F2937"/>
-                <w:sz w:val="19"/>
-              </w:rPr>
-              <w:t>En estricto apego a las directrices de validación técnica y evidencia experimental del Programa de Evidencias de Aprendizaje de la Unidad de Aprendizaje: Proyecto de Ingeniería Aplicada (IEAI) de la Facultad de Ingeniería Mecánica y Eléctrica (FIME - UANL), el ecosistema completo de diseño del proyecto ExpendeX —incluyendo los modelos tridimensionales CAD paramétricos en Autodesk Fusion 360, esquemáticos y diseño de circuito impreso (PCB) en EasyEDA, código fuente del firmware en C++ para ESP32 FreeRTOS (Wokwi / PlatformIO), la suite web del quiosco y panel administrativo, y la documentación académica completa de las 5 Actividades Fundamentales— se encuentra configurado con acceso público directo vía enlace para que cualquier docente, evaluador o estudiante con el hipervínculo acceda de inmediato sin barreras de autenticación:</w:t>
-              <w:br/>
-              <w:br/>
-              <w:t>• URL Oficial (Acceso Abierto vía Enlace): https://github.com/Anubys6/ExpendeX-Smart-Vending-FIME</w:t>
-              <w:br/>
-              <w:t>• Licencia: MIT License (Código abierto institucional FIME UANL)</w:t>
-            </w:r>
-          </w:p>
-        </w:tc>
-      </w:tr>
-    </w:tbl>
     <w:p>
       <w:pPr>
         <w:jc w:val="center"/>

</xml_diff>

<commit_message>
style(portadas): portada ocupa pagina 1 completa con salto a pagina 2 para indice y contenido
</commit_message>
<xml_diff>
--- a/01_DOCUMENTOS_ACADEMICOS_FIME/AF2_Presentacion_Resultados_Examen_Ordinario_Paper_Vending_FIME.docx
+++ b/01_DOCUMENTOS_ACADEMICOS_FIME/AF2_Presentacion_Resultados_Examen_Ordinario_Paper_Vending_FIME.docx
@@ -132,7 +132,7 @@
     </w:tbl>
     <w:p>
       <w:pPr>
-        <w:spacing w:before="280" w:after="40"/>
+        <w:spacing w:before="240" w:after="120"/>
         <w:jc w:val="center"/>
       </w:pPr>
       <w:r/>
@@ -158,7 +158,7 @@
     </w:p>
     <w:p>
       <w:pPr>
-        <w:spacing w:before="280" w:after="40"/>
+        <w:spacing w:before="200" w:after="200"/>
         <w:jc w:val="center"/>
       </w:pPr>
       <w:r/>
@@ -610,7 +610,7 @@
     </w:tbl>
     <w:p>
       <w:pPr>
-        <w:spacing w:before="280" w:line="300" w:lineRule="auto" w:after="80"/>
+        <w:spacing w:before="280" w:line="300" w:lineRule="auto" w:after="60"/>
         <w:jc w:val="center"/>
       </w:pPr>
       <w:r/>
@@ -633,7 +633,7 @@
     </w:p>
     <w:p>
       <w:pPr>
-        <w:spacing w:before="80" w:after="80"/>
+        <w:spacing w:before="40" w:after="40"/>
         <w:jc w:val="center"/>
       </w:pPr>
       <w:r/>
@@ -682,7 +682,7 @@
     </w:p>
     <w:p>
       <w:pPr>
-        <w:spacing w:before="80" w:after="80"/>
+        <w:spacing w:before="40" w:after="40"/>
         <w:jc w:val="center"/>
       </w:pPr>
       <w:r/>
@@ -717,7 +717,7 @@
     </w:p>
     <w:p>
       <w:pPr>
-        <w:spacing w:before="80" w:after="280"/>
+        <w:spacing w:before="40" w:after="280"/>
         <w:jc w:val="center"/>
       </w:pPr>
       <w:r/>
@@ -779,6 +779,7 @@
           <w:sz w:val="17"/>
         </w:rPr>
         <w:t>En estricto apego al Programa de Evidencias de Aprendizaje de la U.A. Proyecto de Ingeniería Aplicada (IEA)</w:t>
+        <w:br w:type="page"/>
       </w:r>
     </w:p>
     <w:p>

</xml_diff>

<commit_message>
style(portadas): retirar texto redundante del medio en portadas (diseno de experimentos de la maquina)
</commit_message>
<xml_diff>
--- a/01_DOCUMENTOS_ACADEMICOS_FIME/AF2_Presentacion_Resultados_Examen_Ordinario_Paper_Vending_FIME.docx
+++ b/01_DOCUMENTOS_ACADEMICOS_FIME/AF2_Presentacion_Resultados_Examen_Ordinario_Paper_Vending_FIME.docx
@@ -132,7 +132,7 @@
     </w:tbl>
     <w:p>
       <w:pPr>
-        <w:spacing w:before="240" w:after="120"/>
+        <w:spacing w:before="280" w:after="120"/>
         <w:jc w:val="center"/>
       </w:pPr>
       <w:r/>
@@ -141,7 +141,7 @@
           <w:rFonts w:ascii="Calibri" w:hAnsi="Calibri"/>
           <w:b/>
           <w:color w:val="0F2C59"/>
-          <w:sz w:val="26"/>
+          <w:sz w:val="27"/>
         </w:rPr>
         <w:t>UNIVERSIDAD AUTÓNOMA DE NUEVO LEÓN</w:t>
         <w:br/>
@@ -151,14 +151,14 @@
           <w:rFonts w:ascii="Calibri" w:hAnsi="Calibri"/>
           <w:b/>
           <w:color w:val="1E40AF"/>
-          <w:sz w:val="23"/>
+          <w:sz w:val="24"/>
         </w:rPr>
         <w:t>FACULTAD DE INGENIERÍA MECÁNICA Y ELÉCTRICA</w:t>
       </w:r>
     </w:p>
     <w:p>
       <w:pPr>
-        <w:spacing w:before="200" w:after="200"/>
+        <w:spacing w:before="360" w:after="400"/>
         <w:jc w:val="center"/>
       </w:pPr>
       <w:r/>
@@ -177,23 +177,11 @@
           <w:rFonts w:ascii="Calibri" w:hAnsi="Calibri"/>
           <w:b/>
           <w:color w:val="0F2C59"/>
-          <w:sz w:val="23"/>
+          <w:sz w:val="24"/>
         </w:rPr>
         <w:t>ACTIVIDAD FUNDAMENTAL 2 (AF2 — 20%): EXAMEN ORDINARIO</w:t>
         <w:br/>
         <w:t>PRESENTACIÓN DE RESULTADOS Y VALIDACIÓN EXPERIMENTAL</w:t>
-        <w:br/>
-        <w:br/>
-      </w:r>
-      <w:r>
-        <w:rPr>
-          <w:rFonts w:ascii="Calibri" w:hAnsi="Calibri"/>
-          <w:b/>
-          <w:i/>
-          <w:color w:val="1E293B"/>
-          <w:sz w:val="19"/>
-        </w:rPr>
-        <w:t>«REPORTE TÉCNICO DE RESULTADOS, ANÁLISIS DE CONCORDANCIA TEÓRICO-SIMULADO-EXPERIMENTAL Y DEMOSTRACIÓN FUNCIONAL DE LA MÁQUINA AUTOMATIZADA HÍBRIDA EXPENDEX (36 CANALES MIXTOS 1+4+1 CON MOTORREDUCTORES 24V DC, RECIPIENTES CUADRADOS DE 3 DIVISIONES Y PANTALLA TÁCTIL DE 10.1 PULGADAS)»</w:t>
       </w:r>
     </w:p>
     <w:tbl>
@@ -610,7 +598,7 @@
     </w:tbl>
     <w:p>
       <w:pPr>
-        <w:spacing w:before="280" w:line="300" w:lineRule="auto" w:after="60"/>
+        <w:spacing w:before="440" w:line="300" w:lineRule="auto" w:after="60"/>
         <w:jc w:val="center"/>
       </w:pPr>
       <w:r/>
@@ -717,7 +705,7 @@
     </w:p>
     <w:p>
       <w:pPr>
-        <w:spacing w:before="40" w:after="280"/>
+        <w:spacing w:before="40" w:after="360"/>
         <w:jc w:val="center"/>
       </w:pPr>
       <w:r/>
@@ -739,7 +727,7 @@
     </w:p>
     <w:p>
       <w:pPr>
-        <w:spacing w:before="200" w:after="0"/>
+        <w:spacing w:before="320" w:after="0"/>
         <w:jc w:val="center"/>
       </w:pPr>
       <w:r/>

</xml_diff>

<commit_message>
fix(portadas-presentacion): grupo 005, salon 7208, jueves M4-M6, eliminar brigada, layout vertical en diapositivas 02-04 y maquinas completas
</commit_message>
<xml_diff>
--- a/01_DOCUMENTOS_ACADEMICOS_FIME/AF2_Presentacion_Resultados_Examen_Ordinario_Paper_Vending_FIME.docx
+++ b/01_DOCUMENTOS_ACADEMICOS_FIME/AF2_Presentacion_Resultados_Examen_Ordinario_Paper_Vending_FIME.docx
@@ -624,7 +624,6 @@
         <w:spacing w:before="40" w:after="40"/>
         <w:jc w:val="center"/>
       </w:pPr>
-      <w:r/>
       <w:r>
         <w:rPr>
           <w:rFonts w:ascii="Calibri" w:hAnsi="Calibri"/>
@@ -636,22 +635,9 @@
       <w:r>
         <w:rPr>
           <w:rFonts w:ascii="Calibri" w:hAnsi="Calibri"/>
-        </w:rPr>
-        <w:t xml:space="preserve">001   |   </w:t>
-      </w:r>
-      <w:r>
-        <w:rPr>
-          <w:rFonts w:ascii="Calibri" w:hAnsi="Calibri"/>
-          <w:b/>
           <w:sz w:val="21"/>
         </w:rPr>
-        <w:t xml:space="preserve">Brigada: </w:t>
-      </w:r>
-      <w:r>
-        <w:rPr>
-          <w:rFonts w:ascii="Calibri" w:hAnsi="Calibri"/>
-        </w:rPr>
-        <w:t xml:space="preserve">107   |   </w:t>
+        <w:t xml:space="preserve">005   |   </w:t>
       </w:r>
       <w:r>
         <w:rPr>
@@ -664,8 +650,9 @@
       <w:r>
         <w:rPr>
           <w:rFonts w:ascii="Calibri" w:hAnsi="Calibri"/>
+          <w:sz w:val="21"/>
         </w:rPr>
-        <w:t>LED1</w:t>
+        <w:t>7208</w:t>
       </w:r>
     </w:p>
     <w:p>
@@ -673,7 +660,6 @@
         <w:spacing w:before="40" w:after="40"/>
         <w:jc w:val="center"/>
       </w:pPr>
-      <w:r/>
       <w:r>
         <w:rPr>
           <w:rFonts w:ascii="Calibri" w:hAnsi="Calibri"/>
@@ -685,8 +671,9 @@
       <w:r>
         <w:rPr>
           <w:rFonts w:ascii="Calibri" w:hAnsi="Calibri"/>
+          <w:sz w:val="21"/>
         </w:rPr>
-        <w:t xml:space="preserve">Viernes (V5)   |   </w:t>
+        <w:t xml:space="preserve">Jueves   |   </w:t>
       </w:r>
       <w:r>
         <w:rPr>
@@ -699,8 +686,9 @@
       <w:r>
         <w:rPr>
           <w:rFonts w:ascii="Calibri" w:hAnsi="Calibri"/>
+          <w:sz w:val="21"/>
         </w:rPr>
-        <w:t>N1 (18:40 – 19:30 h)</w:t>
+        <w:t>M4 a M6</w:t>
       </w:r>
     </w:p>
     <w:p>
@@ -737,7 +725,7 @@
           <w:color w:val="0F172A"/>
           <w:sz w:val="21"/>
         </w:rPr>
-        <w:t>San Nicolás de los Garza, Nuevo León a 22 de octubre de 2026</w:t>
+        <w:t>San Nicolás de los Garza, Nuevo León a 29 de octubre de 2026</w:t>
         <w:br/>
       </w:r>
       <w:r>

</xml_diff>